<commit_message>
Report: frame the methodology as a proof of concept (PoC)
Lead §3.1 Methods with a "Methodology — proof of concept" framing (demonstrate
feasibility end-to-end of the novel combination; deliberately scoped — synthetic
incidents, free-tier/on-demand cloud, demo-grade paths — yet working, deployed and
tested), with the iterative Scrum-for-solo process kept as how the PoC was built.
Thread PoC consistently into the Executive Summary (Methods/Outcome), §5.3
Conclusions (Strengths), and add a Glossary entry. Re-export the .docx.

Co-Authored-By: Claude Opus 4.8 <noreply@anthropic.com>
Claude-Session: https://claude.ai/code/session_01JPrcUrs3JqCy2UmTJDjuip
</commit_message>
<xml_diff>
--- a/docs/FINAL_REPORT.docx
+++ b/docs/FINAL_REPORT.docx
@@ -324,7 +324,29 @@
         <w:t xml:space="preserve"> </w:t>
       </w:r>
       <w:r>
-        <w:t xml:space="preserve">Extended an existing SUMO model with a WebSocket emitter; built an AWS</w:t>
+        <w:t xml:space="preserve">The system was built as a</w:t>
+      </w:r>
+      <w:r>
+        <w:t xml:space="preserve"> </w:t>
+      </w:r>
+      <w:r>
+        <w:rPr>
+          <w:bCs/>
+          <w:b/>
+        </w:rPr>
+        <w:t xml:space="preserve">proof of concept</w:t>
+      </w:r>
+      <w:r>
+        <w:t xml:space="preserve"> </w:t>
+      </w:r>
+      <w:r>
+        <w:t xml:space="preserve">to demonstrate feasibility</w:t>
+      </w:r>
+      <w:r>
+        <w:t xml:space="preserve"> </w:t>
+      </w:r>
+      <w:r>
+        <w:t xml:space="preserve">end-to-end. It extends an existing SUMO model with a WebSocket emitter; builds an AWS</w:t>
       </w:r>
       <w:r>
         <w:t xml:space="preserve"> </w:t>
@@ -336,13 +358,19 @@
         <w:t xml:space="preserve"> </w:t>
       </w:r>
       <w:r>
-        <w:t xml:space="preserve">as-code; extended a Leaflet/Chart.js dashboard with incident injection, scenario</w:t>
-      </w:r>
-      <w:r>
-        <w:t xml:space="preserve"> </w:t>
-      </w:r>
-      <w:r>
-        <w:t xml:space="preserve">comparison and impact reporting; packaged it with Docker Compose and GitHub Actions CI.</w:t>
+        <w:t xml:space="preserve">as-code; extends a Leaflet/Chart.js dashboard with incident injection, scenario comparison</w:t>
+      </w:r>
+      <w:r>
+        <w:t xml:space="preserve"> </w:t>
+      </w:r>
+      <w:r>
+        <w:t xml:space="preserve">and impact reporting; and packages it with Docker Compose and GitHub Actions CI, developed</w:t>
+      </w:r>
+      <w:r>
+        <w:t xml:space="preserve"> </w:t>
+      </w:r>
+      <w:r>
+        <w:t xml:space="preserve">through iterative milestone increments.</w:t>
       </w:r>
     </w:p>
     <w:p>
@@ -366,19 +394,35 @@
         <w:t xml:space="preserve"> </w:t>
       </w:r>
       <w:r>
-        <w:t xml:space="preserve">deployable twin. Strengths: real-time operation and an honest baseline-vs-incident</w:t>
-      </w:r>
-      <w:r>
-        <w:t xml:space="preserve"> </w:t>
-      </w:r>
-      <w:r>
-        <w:t xml:space="preserve">comparison runnable with one command. Limitations: incidents are synthetic, and a</w:t>
-      </w:r>
-      <w:r>
-        <w:t xml:space="preserve"> </w:t>
-      </w:r>
-      <w:r>
-        <w:t xml:space="preserve">closure caps speed rather than rerouting traffic.</w:t>
+        <w:t xml:space="preserve">deployable</w:t>
+      </w:r>
+      <w:r>
+        <w:t xml:space="preserve"> </w:t>
+      </w:r>
+      <w:r>
+        <w:rPr>
+          <w:bCs/>
+          <w:b/>
+        </w:rPr>
+        <w:t xml:space="preserve">proof-of-concept</w:t>
+      </w:r>
+      <w:r>
+        <w:t xml:space="preserve"> </w:t>
+      </w:r>
+      <w:r>
+        <w:t xml:space="preserve">twin. Strengths: real-time operation and an honest</w:t>
+      </w:r>
+      <w:r>
+        <w:t xml:space="preserve"> </w:t>
+      </w:r>
+      <w:r>
+        <w:t xml:space="preserve">baseline-vs-incident comparison runnable with one command. Limitations (consistent with a</w:t>
+      </w:r>
+      <w:r>
+        <w:t xml:space="preserve"> </w:t>
+      </w:r>
+      <w:r>
+        <w:t xml:space="preserve">PoC): incidents are synthetic, and a closure caps speed rather than rerouting traffic.</w:t>
       </w:r>
     </w:p>
     <w:p>
@@ -531,6 +575,36 @@
             </w:pPr>
             <w:r>
               <w:t xml:space="preserve">A live, data-driven virtual model of a real system used to monitor and test "what-if" scenarios.</w:t>
+            </w:r>
+          </w:p>
+        </w:tc>
+      </w:tr>
+      <w:tr>
+        <w:tc>
+          <w:tcPr/>
+          <w:p>
+            <w:pPr>
+              <w:pStyle w:val="Compact"/>
+              <w:jc w:val="left"/>
+            </w:pPr>
+            <w:r>
+              <w:rPr>
+                <w:bCs/>
+                <w:b/>
+              </w:rPr>
+              <w:t xml:space="preserve">Proof of concept (PoC)</w:t>
+            </w:r>
+          </w:p>
+        </w:tc>
+        <w:tc>
+          <w:tcPr/>
+          <w:p>
+            <w:pPr>
+              <w:pStyle w:val="Compact"/>
+              <w:jc w:val="left"/>
+            </w:pPr>
+            <w:r>
+              <w:t xml:space="preserve">A limited but working implementation built to demonstrate that an idea is feasible, rather than a production-ready product.</w:t>
             </w:r>
           </w:p>
         </w:tc>
@@ -2128,23 +2202,215 @@
           <w:bCs/>
           <w:b/>
         </w:rPr>
-        <w:t xml:space="preserve">Project management.</w:t>
-      </w:r>
-      <w:r>
-        <w:t xml:space="preserve"> </w:t>
-      </w:r>
-      <w:r>
-        <w:t xml:space="preserve">The project used</w:t>
-      </w:r>
-      <w:r>
-        <w:t xml:space="preserve"> </w:t>
-      </w:r>
-      <w:r>
-        <w:rPr>
-          <w:bCs/>
-          <w:b/>
-        </w:rPr>
-        <w:t xml:space="preserve">Scrum adapted for a single developer</w:t>
+        <w:t xml:space="preserve">Methodology — proof of concept.</w:t>
+      </w:r>
+      <w:r>
+        <w:t xml:space="preserve"> </w:t>
+      </w:r>
+      <w:r>
+        <w:t xml:space="preserve">The project was developed as a</w:t>
+      </w:r>
+      <w:r>
+        <w:t xml:space="preserve"> </w:t>
+      </w:r>
+      <w:r>
+        <w:rPr>
+          <w:bCs/>
+          <w:b/>
+        </w:rPr>
+        <w:t xml:space="preserve">proof of concept</w:t>
+      </w:r>
+      <w:r>
+        <w:rPr>
+          <w:bCs/>
+          <w:b/>
+        </w:rPr>
+        <w:t xml:space="preserve"> </w:t>
+      </w:r>
+      <w:r>
+        <w:rPr>
+          <w:bCs/>
+          <w:b/>
+        </w:rPr>
+        <w:t xml:space="preserve">(PoC)</w:t>
+      </w:r>
+      <w:r>
+        <w:t xml:space="preserve">: its purpose is to demonstrate, end-to-end, the</w:t>
+      </w:r>
+      <w:r>
+        <w:t xml:space="preserve"> </w:t>
+      </w:r>
+      <w:r>
+        <w:rPr>
+          <w:iCs/>
+          <w:i/>
+        </w:rPr>
+        <w:t xml:space="preserve">feasibility</w:t>
+      </w:r>
+      <w:r>
+        <w:t xml:space="preserve"> </w:t>
+      </w:r>
+      <w:r>
+        <w:t xml:space="preserve">of a cloud-connected</w:t>
+      </w:r>
+      <w:r>
+        <w:t xml:space="preserve"> </w:t>
+      </w:r>
+      <w:r>
+        <w:t xml:space="preserve">decision-support traffic digital twin — not to deliver a production-hardened system. A PoC</w:t>
+      </w:r>
+      <w:r>
+        <w:t xml:space="preserve"> </w:t>
+      </w:r>
+      <w:r>
+        <w:t xml:space="preserve">approach was appropriate because the contribution is a</w:t>
+      </w:r>
+      <w:r>
+        <w:t xml:space="preserve"> </w:t>
+      </w:r>
+      <w:r>
+        <w:rPr>
+          <w:bCs/>
+          <w:b/>
+        </w:rPr>
+        <w:t xml:space="preserve">novel combination</w:t>
+      </w:r>
+      <w:r>
+        <w:t xml:space="preserve"> </w:t>
+      </w:r>
+      <w:r>
+        <w:t xml:space="preserve">of pieces that</w:t>
+      </w:r>
+      <w:r>
+        <w:t xml:space="preserve"> </w:t>
+      </w:r>
+      <w:r>
+        <w:t xml:space="preserve">exist only separately (a calibrated real-city SUMO simulation, a serverless cloud pipeline,</w:t>
+      </w:r>
+      <w:r>
+        <w:t xml:space="preserve"> </w:t>
+      </w:r>
+      <w:r>
+        <w:t xml:space="preserve">and a decision-support dashboard — see §2.2), so the first question to answer is "can these</w:t>
+      </w:r>
+      <w:r>
+        <w:t xml:space="preserve"> </w:t>
+      </w:r>
+      <w:r>
+        <w:t xml:space="preserve">be made to work together, reliably, at the required latency, within a student budget?".</w:t>
+      </w:r>
+      <w:r>
+        <w:t xml:space="preserve"> </w:t>
+      </w:r>
+      <w:r>
+        <w:t xml:space="preserve">The PoC is therefore deliberately</w:t>
+      </w:r>
+      <w:r>
+        <w:t xml:space="preserve"> </w:t>
+      </w:r>
+      <w:r>
+        <w:rPr>
+          <w:bCs/>
+          <w:b/>
+        </w:rPr>
+        <w:t xml:space="preserve">scoped</w:t>
+      </w:r>
+      <w:r>
+        <w:t xml:space="preserve">: incidents are synthetic (what-if</w:t>
+      </w:r>
+      <w:r>
+        <w:t xml:space="preserve"> </w:t>
+      </w:r>
+      <w:r>
+        <w:t xml:space="preserve">perturbations, not live sensor data), the cloud runs on free-tier / on-demand resources,</w:t>
+      </w:r>
+      <w:r>
+        <w:t xml:space="preserve"> </w:t>
+      </w:r>
+      <w:r>
+        <w:t xml:space="preserve">and some paths are demo-grade rather than fully productionised (see §5.3 Limitations). It</w:t>
+      </w:r>
+      <w:r>
+        <w:t xml:space="preserve"> </w:t>
+      </w:r>
+      <w:r>
+        <w:t xml:space="preserve">is nonetheless a</w:t>
+      </w:r>
+      <w:r>
+        <w:t xml:space="preserve"> </w:t>
+      </w:r>
+      <w:r>
+        <w:rPr>
+          <w:bCs/>
+          <w:b/>
+        </w:rPr>
+        <w:t xml:space="preserve">working, deployed and tested</w:t>
+      </w:r>
+      <w:r>
+        <w:t xml:space="preserve"> </w:t>
+      </w:r>
+      <w:r>
+        <w:t xml:space="preserve">implementation, so it proves the concept</w:t>
+      </w:r>
+      <w:r>
+        <w:t xml:space="preserve"> </w:t>
+      </w:r>
+      <w:r>
+        <w:t xml:space="preserve">rather than merely describing it. Success is judged by the proof-of-concept criteria in</w:t>
+      </w:r>
+      <w:r>
+        <w:t xml:space="preserve"> </w:t>
+      </w:r>
+      <w:r>
+        <w:t xml:space="preserve">§2.1 (the pipeline works end-to-end, an injected incident produces a measurable impact, and</w:t>
+      </w:r>
+      <w:r>
+        <w:t xml:space="preserve"> </w:t>
+      </w:r>
+      <w:r>
+        <w:t xml:space="preserve">the stack is reproducibly deployable).</w:t>
+      </w:r>
+    </w:p>
+    <w:p>
+      <w:pPr>
+        <w:pStyle w:val="BodyText"/>
+      </w:pPr>
+      <w:r>
+        <w:rPr>
+          <w:bCs/>
+          <w:b/>
+        </w:rPr>
+        <w:t xml:space="preserve">Development process.</w:t>
+      </w:r>
+      <w:r>
+        <w:t xml:space="preserve"> </w:t>
+      </w:r>
+      <w:r>
+        <w:t xml:space="preserve">Within that PoC, the build used</w:t>
+      </w:r>
+      <w:r>
+        <w:t xml:space="preserve"> </w:t>
+      </w:r>
+      <w:r>
+        <w:rPr>
+          <w:bCs/>
+          <w:b/>
+        </w:rPr>
+        <w:t xml:space="preserve">Scrum adapted for a single</w:t>
+      </w:r>
+      <w:r>
+        <w:rPr>
+          <w:bCs/>
+          <w:b/>
+        </w:rPr>
+        <w:t xml:space="preserve"> </w:t>
+      </w:r>
+      <w:r>
+        <w:rPr>
+          <w:bCs/>
+          <w:b/>
+        </w:rPr>
+        <w:t xml:space="preserve">developer</w:t>
       </w:r>
       <w:r>
         <w:t xml:space="preserve">. The</w:t>
@@ -6255,31 +6521,37 @@
         <w:t xml:space="preserve"> </w:t>
       </w:r>
       <w:r>
-        <w:t xml:space="preserve">A working, tested, reproducibly deployable decision-support twin: it runs</w:t>
-      </w:r>
-      <w:r>
-        <w:t xml:space="preserve"> </w:t>
-      </w:r>
-      <w:r>
-        <w:t xml:space="preserve">in real time, lets a non-technical user inject incidents and read a quantified impact,</w:t>
-      </w:r>
-      <w:r>
-        <w:t xml:space="preserve"> </w:t>
-      </w:r>
-      <w:r>
-        <w:t xml:space="preserve">and can be stood up with one command locally or deployed to AWS as code. The honest</w:t>
-      </w:r>
-      <w:r>
-        <w:t xml:space="preserve"> </w:t>
-      </w:r>
-      <w:r>
-        <w:t xml:space="preserve">framing (synthetic incidents on a calibrated baseline) is defensible, and quality</w:t>
-      </w:r>
-      <w:r>
-        <w:t xml:space="preserve"> </w:t>
-      </w:r>
-      <w:r>
-        <w:t xml:space="preserve">engineering (91 tests, CI, IaC, layered docs) supports it.</w:t>
+        <w:t xml:space="preserve">As a proof of concept, the project succeeds: it is a working, tested,</w:t>
+      </w:r>
+      <w:r>
+        <w:t xml:space="preserve"> </w:t>
+      </w:r>
+      <w:r>
+        <w:t xml:space="preserve">reproducibly deployable decision-support twin that runs in real time, lets a non-technical</w:t>
+      </w:r>
+      <w:r>
+        <w:t xml:space="preserve"> </w:t>
+      </w:r>
+      <w:r>
+        <w:t xml:space="preserve">user inject incidents and read a quantified impact, and can be stood up with one command</w:t>
+      </w:r>
+      <w:r>
+        <w:t xml:space="preserve"> </w:t>
+      </w:r>
+      <w:r>
+        <w:t xml:space="preserve">locally or deployed to AWS as code — demonstrating that the novel combination at its core</w:t>
+      </w:r>
+      <w:r>
+        <w:t xml:space="preserve"> </w:t>
+      </w:r>
+      <w:r>
+        <w:t xml:space="preserve">is feasible. The honest framing (synthetic incidents on a calibrated baseline) is</w:t>
+      </w:r>
+      <w:r>
+        <w:t xml:space="preserve"> </w:t>
+      </w:r>
+      <w:r>
+        <w:t xml:space="preserve">defensible, and quality engineering (91 tests, CI, IaC, layered docs) supports it.</w:t>
       </w:r>
     </w:p>
     <w:p>

</xml_diff>

<commit_message>
Report: describe the dev process honestly (lightweight Scrum-inspired, no Jira)
The methods section implied formal Scrum (backlog, sprint review, retrospective,
Scrum roles). No issue-tracker/Jira or formal ceremonies were actually used.
Reframe §3.1 "Development process" as a lightweight, iterative Scrum/agile-inspired
approach: milestones as iterations, build-and-test, milestone reviews with the
supervisor for feedback, and tracking in the repo (CLAUDE.md, CHECKLIST.md) +
weekly journals rather than a project-management tool. Re-export the .docx.

Co-Authored-By: Claude Opus 4.8 <noreply@anthropic.com>
Claude-Session: https://claude.ai/code/session_01JPrcUrs3JqCy2UmTJDjuip
</commit_message>
<xml_diff>
--- a/docs/FINAL_REPORT.docx
+++ b/docs/FINAL_REPORT.docx
@@ -2386,76 +2386,122 @@
         <w:t xml:space="preserve"> </w:t>
       </w:r>
       <w:r>
-        <w:t xml:space="preserve">Within that PoC, the build used</w:t>
-      </w:r>
-      <w:r>
-        <w:t xml:space="preserve"> </w:t>
-      </w:r>
-      <w:r>
-        <w:rPr>
-          <w:bCs/>
-          <w:b/>
-        </w:rPr>
-        <w:t xml:space="preserve">Scrum adapted for a single</w:t>
-      </w:r>
-      <w:r>
-        <w:rPr>
-          <w:bCs/>
-          <w:b/>
-        </w:rPr>
-        <w:t xml:space="preserve"> </w:t>
-      </w:r>
-      <w:r>
-        <w:rPr>
-          <w:bCs/>
-          <w:b/>
-        </w:rPr>
-        <w:t xml:space="preserve">developer</w:t>
-      </w:r>
-      <w:r>
-        <w:t xml:space="preserve">. The</w:t>
-      </w:r>
-      <w:r>
-        <w:t xml:space="preserve"> </w:t>
-      </w:r>
-      <w:r>
-        <w:t xml:space="preserve">five milestones (§2.1) doubled as sprints: each began by planning that milestone's tasks</w:t>
-      </w:r>
-      <w:r>
-        <w:t xml:space="preserve"> </w:t>
-      </w:r>
-      <w:r>
-        <w:t xml:space="preserve">into a backlog, ran through self-review against that backlog, and ended with a sprint</w:t>
-      </w:r>
-      <w:r>
-        <w:t xml:space="preserve"> </w:t>
-      </w:r>
-      <w:r>
-        <w:t xml:space="preserve">review demonstrating the working increment to the supervisor (acting as product owner),</w:t>
-      </w:r>
-      <w:r>
-        <w:t xml:space="preserve"> </w:t>
-      </w:r>
-      <w:r>
-        <w:t xml:space="preserve">followed by a short retrospective. One person covered all Scrum roles, but the</w:t>
-      </w:r>
-      <w:r>
-        <w:t xml:space="preserve"> </w:t>
-      </w:r>
-      <w:r>
-        <w:t xml:space="preserve">plan–build–review–retrospective cycle was kept for every milestone, which suited a project</w:t>
-      </w:r>
-      <w:r>
-        <w:t xml:space="preserve"> </w:t>
-      </w:r>
-      <w:r>
-        <w:t xml:space="preserve">where each milestone delivers a demonstrable increment that benefits from feedback before</w:t>
-      </w:r>
-      <w:r>
-        <w:t xml:space="preserve"> </w:t>
-      </w:r>
-      <w:r>
-        <w:t xml:space="preserve">the next layer is built on it.</w:t>
+        <w:t xml:space="preserve">Within that PoC, the build followed a</w:t>
+      </w:r>
+      <w:r>
+        <w:t xml:space="preserve"> </w:t>
+      </w:r>
+      <w:r>
+        <w:rPr>
+          <w:bCs/>
+          <w:b/>
+        </w:rPr>
+        <w:t xml:space="preserve">lightweight, iterative</w:t>
+      </w:r>
+      <w:r>
+        <w:rPr>
+          <w:bCs/>
+          <w:b/>
+        </w:rPr>
+        <w:t xml:space="preserve"> </w:t>
+      </w:r>
+      <w:r>
+        <w:rPr>
+          <w:bCs/>
+          <w:b/>
+        </w:rPr>
+        <w:t xml:space="preserve">approach inspired by Scrum / agile</w:t>
+      </w:r>
+      <w:r>
+        <w:t xml:space="preserve">, rather than formal Scrum with a dedicated</w:t>
+      </w:r>
+      <w:r>
+        <w:t xml:space="preserve"> </w:t>
+      </w:r>
+      <w:r>
+        <w:t xml:space="preserve">project-management tool. The five milestones (§2.1) acted as iterations: each began by</w:t>
+      </w:r>
+      <w:r>
+        <w:t xml:space="preserve"> </w:t>
+      </w:r>
+      <w:r>
+        <w:t xml:space="preserve">breaking the milestone into tasks, proceeded through build-and-test, and ended by</w:t>
+      </w:r>
+      <w:r>
+        <w:t xml:space="preserve"> </w:t>
+      </w:r>
+      <w:r>
+        <w:t xml:space="preserve">demonstrating the working increment to the supervisor at a milestone review and adjusting</w:t>
+      </w:r>
+      <w:r>
+        <w:t xml:space="preserve"> </w:t>
+      </w:r>
+      <w:r>
+        <w:t xml:space="preserve">the plan for the next iteration. As a solo developer there were no formal Scrum ceremonies</w:t>
+      </w:r>
+      <w:r>
+        <w:t xml:space="preserve"> </w:t>
+      </w:r>
+      <w:r>
+        <w:t xml:space="preserve">or roles and</w:t>
+      </w:r>
+      <w:r>
+        <w:t xml:space="preserve"> </w:t>
+      </w:r>
+      <w:r>
+        <w:rPr>
+          <w:bCs/>
+          <w:b/>
+        </w:rPr>
+        <w:t xml:space="preserve">no issue-tracker such as Jira</w:t>
+      </w:r>
+      <w:r>
+        <w:t xml:space="preserve">; instead the task list, design decisions and</w:t>
+      </w:r>
+      <w:r>
+        <w:t xml:space="preserve"> </w:t>
+      </w:r>
+      <w:r>
+        <w:t xml:space="preserve">a running hour budget were tracked in the repository itself (</w:t>
+      </w:r>
+      <w:r>
+        <w:rPr>
+          <w:rStyle w:val="VerbatimChar"/>
+        </w:rPr>
+        <w:t xml:space="preserve">CLAUDE.md</w:t>
+      </w:r>
+      <w:r>
+        <w:t xml:space="preserve">,</w:t>
+      </w:r>
+      <w:r>
+        <w:t xml:space="preserve"> </w:t>
+      </w:r>
+      <w:r>
+        <w:rPr>
+          <w:rStyle w:val="VerbatimChar"/>
+        </w:rPr>
+        <w:t xml:space="preserve">CHECKLIST.md</w:t>
+      </w:r>
+      <w:r>
+        <w:t xml:space="preserve">)</w:t>
+      </w:r>
+      <w:r>
+        <w:t xml:space="preserve"> </w:t>
+      </w:r>
+      <w:r>
+        <w:t xml:space="preserve">and in weekly journals. This plan–build–review–adjust cycle suited a project where each</w:t>
+      </w:r>
+      <w:r>
+        <w:t xml:space="preserve"> </w:t>
+      </w:r>
+      <w:r>
+        <w:t xml:space="preserve">milestone delivers a demonstrable increment that benefits from feedback before the next</w:t>
+      </w:r>
+      <w:r>
+        <w:t xml:space="preserve"> </w:t>
+      </w:r>
+      <w:r>
+        <w:t xml:space="preserve">layer is built on it.</w:t>
       </w:r>
     </w:p>
     <w:p>

</xml_diff>

<commit_message>
Report: reformat sub-goals as # / Sub-Goal / Measure of Success
Convert the §2.1 sub-goals table from (#, milestone, deadline) to (#, Sub-Goal,
Measure of Success), folding the proposal's success metrics into a specific
measure per milestone and keeping the cross-cutting ones (single recorded run,
supervisor sign-off, report evaluation) as a short overall success-criteria line.
Re-export the .docx.

Co-Authored-By: Claude Opus 4.8 <noreply@anthropic.com>
Claude-Session: https://claude.ai/code/session_01JPrcUrs3JqCy2UmTJDjuip
</commit_message>
<xml_diff>
--- a/docs/FINAL_REPORT.docx
+++ b/docs/FINAL_REPORT.docx
@@ -1516,19 +1516,19 @@
               <w:jc w:val="left"/>
             </w:pPr>
             <w:r>
-              <w:t xml:space="preserve">Sub-goal (milestone)</w:t>
-            </w:r>
-          </w:p>
-        </w:tc>
-        <w:tc>
-          <w:tcPr/>
-          <w:p>
-            <w:pPr>
-              <w:pStyle w:val="Compact"/>
-              <w:jc w:val="left"/>
-            </w:pPr>
-            <w:r>
-              <w:t xml:space="preserve">Deadline</w:t>
+              <w:t xml:space="preserve">Sub-Goal</w:t>
+            </w:r>
+          </w:p>
+        </w:tc>
+        <w:tc>
+          <w:tcPr/>
+          <w:p>
+            <w:pPr>
+              <w:pStyle w:val="Compact"/>
+              <w:jc w:val="left"/>
+            </w:pPr>
+            <w:r>
+              <w:t xml:space="preserve">Measure of Success</w:t>
             </w:r>
           </w:p>
         </w:tc>
@@ -1566,7 +1566,7 @@
               <w:jc w:val="left"/>
             </w:pPr>
             <w:r>
-              <w:t xml:space="preserve">16 Aug 2026</w:t>
+              <w:t xml:space="preserve">Vehicle-state JSON is emitted every simulation step and received by a client at sub-second latency; the serialiser is unit-tested</w:t>
             </w:r>
           </w:p>
         </w:tc>
@@ -1604,7 +1604,7 @@
               <w:jc w:val="left"/>
             </w:pPr>
             <w:r>
-              <w:t xml:space="preserve">6 Sep 2026</w:t>
+              <w:t xml:space="preserve">Streamed ticks reach InfluxDB Cloud via API Gateway + Lambda and are queryable; the full AWS stack is defined in Terraform and reprovisions from a clean account</w:t>
             </w:r>
           </w:p>
         </w:tc>
@@ -1642,7 +1642,7 @@
               <w:jc w:val="left"/>
             </w:pPr>
             <w:r>
-              <w:t xml:space="preserve">20 Sep 2026</w:t>
+              <w:t xml:space="preserve">The dashboard shows moving vehicles sourced from the live feed (not the static CSV), with live metric charts updating in real time</w:t>
             </w:r>
           </w:p>
         </w:tc>
@@ -1680,7 +1680,7 @@
               <w:jc w:val="left"/>
             </w:pPr>
             <w:r>
-              <w:t xml:space="preserve">5 Oct 2026</w:t>
+              <w:t xml:space="preserve">At least four decision-support features are demonstrated working live, against stored/streamed data, and signed off by the supervisor</w:t>
             </w:r>
           </w:p>
         </w:tc>
@@ -1718,7 +1718,22 @@
               <w:jc w:val="left"/>
             </w:pPr>
             <w:r>
-              <w:t xml:space="preserve">19 Oct 2026</w:t>
+              <w:t xml:space="preserve">The whole stack starts with a single</w:t>
+            </w:r>
+            <w:r>
+              <w:t xml:space="preserve"> </w:t>
+            </w:r>
+            <w:r>
+              <w:rPr>
+                <w:rStyle w:val="VerbatimChar"/>
+              </w:rPr>
+              <w:t xml:space="preserve">docker compose up</w:t>
+            </w:r>
+            <w:r>
+              <w:t xml:space="preserve"> </w:t>
+            </w:r>
+            <w:r>
+              <w:t xml:space="preserve">command; the CI pipeline runs the test suite automatically on every push</w:t>
             </w:r>
           </w:p>
         </w:tc>
@@ -1733,7 +1748,745 @@
           <w:bCs/>
           <w:b/>
         </w:rPr>
-        <w:t xml:space="preserve">Success metrics (from the proposal):</w:t>
+        <w:t xml:space="preserve">Overall success criteria.</w:t>
+      </w:r>
+      <w:r>
+        <w:t xml:space="preserve"> </w:t>
+      </w:r>
+      <w:r>
+        <w:t xml:space="preserve">As a proof of concept, the project is judged successful when</w:t>
+      </w:r>
+      <w:r>
+        <w:t xml:space="preserve"> </w:t>
+      </w:r>
+      <w:r>
+        <w:t xml:space="preserve">all five sub-goals above are demonstrated working together in a single recorded run, the</w:t>
+      </w:r>
+      <w:r>
+        <w:t xml:space="preserve"> </w:t>
+      </w:r>
+      <w:r>
+        <w:t xml:space="preserve">supervisor signs off on that live demonstration, and this report evaluates the delivered</w:t>
+      </w:r>
+      <w:r>
+        <w:t xml:space="preserve"> </w:t>
+      </w:r>
+      <w:r>
+        <w:t xml:space="preserve">system against these goals.</w:t>
+      </w:r>
+    </w:p>
+    <w:p>
+      <w:pPr>
+        <w:pStyle w:val="BodyText"/>
+      </w:pPr>
+      <w:r>
+        <w:rPr>
+          <w:bCs/>
+          <w:b/>
+        </w:rPr>
+        <w:t xml:space="preserve">Evolution during delivery.</w:t>
+      </w:r>
+      <w:r>
+        <w:t xml:space="preserve"> </w:t>
+      </w:r>
+      <w:r>
+        <w:t xml:space="preserve">Milestone 4 was committed as "at least four</w:t>
+      </w:r>
+      <w:r>
+        <w:t xml:space="preserve"> </w:t>
+      </w:r>
+      <w:r>
+        <w:t xml:space="preserve">decision-support features." During delivery the</w:t>
+      </w:r>
+      <w:r>
+        <w:t xml:space="preserve"> </w:t>
+      </w:r>
+      <w:r>
+        <w:rPr>
+          <w:iCs/>
+          <w:i/>
+        </w:rPr>
+        <w:t xml:space="preserve">specific set</w:t>
+      </w:r>
+      <w:r>
+        <w:t xml:space="preserve"> </w:t>
+      </w:r>
+      <w:r>
+        <w:t xml:space="preserve">evolved from the</w:t>
+      </w:r>
+      <w:r>
+        <w:t xml:space="preserve"> </w:t>
+      </w:r>
+      <w:r>
+        <w:t xml:space="preserve">originally-listed features toward stronger</w:t>
+      </w:r>
+      <w:r>
+        <w:t xml:space="preserve"> </w:t>
+      </w:r>
+      <w:r>
+        <w:rPr>
+          <w:bCs/>
+          <w:b/>
+        </w:rPr>
+        <w:t xml:space="preserve">what-if decision support</w:t>
+      </w:r>
+      <w:r>
+        <w:t xml:space="preserve"> </w:t>
+      </w:r>
+      <w:r>
+        <w:t xml:space="preserve">on the calibrated</w:t>
+      </w:r>
+      <w:r>
+        <w:t xml:space="preserve"> </w:t>
+      </w:r>
+      <w:r>
+        <w:t xml:space="preserve">model: congestion alerts and scenario comparison were kept, incident injection, live</w:t>
+      </w:r>
+      <w:r>
+        <w:t xml:space="preserve"> </w:t>
+      </w:r>
+      <w:r>
+        <w:t xml:space="preserve">click-to-inject and an impact report were added, while historical replay was</w:t>
+      </w:r>
+      <w:r>
+        <w:t xml:space="preserve"> </w:t>
+      </w:r>
+      <w:r>
+        <w:t xml:space="preserve">de-prioritised (the real-data counts path became the comparison</w:t>
+      </w:r>
+      <w:r>
+        <w:t xml:space="preserve"> </w:t>
+      </w:r>
+      <w:r>
+        <w:rPr>
+          <w:bCs/>
+          <w:b/>
+        </w:rPr>
+        <w:t xml:space="preserve">baseline</w:t>
+      </w:r>
+      <w:r>
+        <w:t xml:space="preserve"> </w:t>
+      </w:r>
+      <w:r>
+        <w:t xml:space="preserve">rather than a</w:t>
+      </w:r>
+      <w:r>
+        <w:t xml:space="preserve"> </w:t>
+      </w:r>
+      <w:r>
+        <w:t xml:space="preserve">headline feature) and the threshold-metrics idea was folded into the congestion overlay.</w:t>
+      </w:r>
+      <w:r>
+        <w:t xml:space="preserve"> </w:t>
+      </w:r>
+      <w:r>
+        <w:t xml:space="preserve">The "≥ 4 decision-support features" requirement is therefore met, with a set better</w:t>
+      </w:r>
+      <w:r>
+        <w:t xml:space="preserve"> </w:t>
+      </w:r>
+      <w:r>
+        <w:t xml:space="preserve">aligned to the purpose of a digital twin (see §3.3 and §5.1).</w:t>
+      </w:r>
+    </w:p>
+    <w:bookmarkEnd w:id="28"/>
+    <w:bookmarkStart w:id="29" w:name="Xd6b45fcf3330aa915fa26f3cc215d0e4ed00491"/>
+    <w:p>
+      <w:pPr>
+        <w:pStyle w:val="Heading2"/>
+      </w:pPr>
+      <w:r>
+        <w:t xml:space="preserve">2.2. Comparative Analysis</w:t>
+      </w:r>
+    </w:p>
+    <w:p>
+      <w:pPr>
+        <w:pStyle w:val="FirstParagraph"/>
+      </w:pPr>
+      <w:r>
+        <w:rPr>
+          <w:iCs/>
+          <w:i/>
+        </w:rPr>
+        <w:t xml:space="preserve">(Extended from the comparative study in the proposal.)</w:t>
+      </w:r>
+    </w:p>
+    <w:p>
+      <w:pPr>
+        <w:pStyle w:val="BodyText"/>
+      </w:pPr>
+      <w:r>
+        <w:t xml:space="preserve">Two publicly-documented systems are directly comparable, based on what each documents</w:t>
+      </w:r>
+      <w:r>
+        <w:t xml:space="preserve"> </w:t>
+      </w:r>
+      <w:r>
+        <w:t xml:space="preserve">about itself.</w:t>
+      </w:r>
+    </w:p>
+    <w:p>
+      <w:pPr>
+        <w:pStyle w:val="BodyText"/>
+      </w:pPr>
+      <w:r>
+        <w:t xml:space="preserve">The first is an</w:t>
+      </w:r>
+      <w:r>
+        <w:t xml:space="preserve"> </w:t>
+      </w:r>
+      <w:r>
+        <w:rPr>
+          <w:bCs/>
+          <w:b/>
+        </w:rPr>
+        <w:t xml:space="preserve">open-source SUMO traffic dashboard built with FastAPI and TraCI</w:t>
+      </w:r>
+      <w:r>
+        <w:t xml:space="preserve"> </w:t>
+      </w:r>
+      <w:r>
+        <w:t xml:space="preserve">(keshu-bara, 2025), which already provides live vehicle tracking and congestion detection</w:t>
+      </w:r>
+      <w:r>
+        <w:t xml:space="preserve"> </w:t>
+      </w:r>
+      <w:r>
+        <w:t xml:space="preserve">from a running SUMO simulation. However, by its own documentation it runs entirely on a</w:t>
+      </w:r>
+      <w:r>
+        <w:t xml:space="preserve"> </w:t>
+      </w:r>
+      <w:r>
+        <w:t xml:space="preserve">single machine, updates the browser by</w:t>
+      </w:r>
+      <w:r>
+        <w:t xml:space="preserve"> </w:t>
+      </w:r>
+      <w:r>
+        <w:rPr>
+          <w:iCs/>
+          <w:i/>
+        </w:rPr>
+        <w:t xml:space="preserve">polling</w:t>
+      </w:r>
+      <w:r>
+        <w:t xml:space="preserve"> </w:t>
+      </w:r>
+      <w:r>
+        <w:t xml:space="preserve">rather than genuine streaming, and does</w:t>
+      </w:r>
+      <w:r>
+        <w:t xml:space="preserve"> </w:t>
+      </w:r>
+      <w:r>
+        <w:t xml:space="preserve">not persist data to a database; historical replay is listed only as a planned future</w:t>
+      </w:r>
+      <w:r>
+        <w:t xml:space="preserve"> </w:t>
+      </w:r>
+      <w:r>
+        <w:t xml:space="preserve">feature, not something currently implemented.</w:t>
+      </w:r>
+    </w:p>
+    <w:p>
+      <w:pPr>
+        <w:pStyle w:val="BodyText"/>
+      </w:pPr>
+      <w:r>
+        <w:t xml:space="preserve">The second is a</w:t>
+      </w:r>
+      <w:r>
+        <w:t xml:space="preserve"> </w:t>
+      </w:r>
+      <w:r>
+        <w:rPr>
+          <w:bCs/>
+          <w:b/>
+        </w:rPr>
+        <w:t xml:space="preserve">peer-reviewed cloud architecture that streams SUMO simulation data</w:t>
+      </w:r>
+      <w:r>
+        <w:rPr>
+          <w:bCs/>
+          <w:b/>
+        </w:rPr>
+        <w:t xml:space="preserve"> </w:t>
+      </w:r>
+      <w:r>
+        <w:rPr>
+          <w:bCs/>
+          <w:b/>
+        </w:rPr>
+        <w:t xml:space="preserve">through a serverless AWS pipeline</w:t>
+      </w:r>
+      <w:r>
+        <w:t xml:space="preserve"> </w:t>
+      </w:r>
+      <w:r>
+        <w:t xml:space="preserve">to support a real-time vehicle speed-advisory</w:t>
+      </w:r>
+      <w:r>
+        <w:t xml:space="preserve"> </w:t>
+      </w:r>
+      <w:r>
+        <w:t xml:space="preserve">application (Deng et al., 2024). This shows that an AWS-based, SUMO-driven streaming</w:t>
+      </w:r>
+      <w:r>
+        <w:t xml:space="preserve"> </w:t>
+      </w:r>
+      <w:r>
+        <w:t xml:space="preserve">architecture is viable at a latency requirement similar to the one this project targets.</w:t>
+      </w:r>
+      <w:r>
+        <w:t xml:space="preserve"> </w:t>
+      </w:r>
+      <w:r>
+        <w:t xml:space="preserve">However, the published system was built to evaluate a specific control algorithm rather</w:t>
+      </w:r>
+      <w:r>
+        <w:t xml:space="preserve"> </w:t>
+      </w:r>
+      <w:r>
+        <w:t xml:space="preserve">than to serve as a general-purpose dashboard, and it does not include decision-support</w:t>
+      </w:r>
+      <w:r>
+        <w:t xml:space="preserve"> </w:t>
+      </w:r>
+      <w:r>
+        <w:t xml:space="preserve">features such as alerts, scenario comparison, or historical replay.</w:t>
+      </w:r>
+    </w:p>
+    <w:p>
+      <w:pPr>
+        <w:pStyle w:val="BodyText"/>
+      </w:pPr>
+      <w:r>
+        <w:t xml:space="preserve">Between them, these two systems indicate that the individual pieces of this project — a</w:t>
+      </w:r>
+      <w:r>
+        <w:t xml:space="preserve"> </w:t>
+      </w:r>
+      <w:r>
+        <w:t xml:space="preserve">SUMO dashboard with live tracking, and an AWS-based SUMO streaming pipeline — already</w:t>
+      </w:r>
+      <w:r>
+        <w:t xml:space="preserve"> </w:t>
+      </w:r>
+      <w:r>
+        <w:t xml:space="preserve">exist separately. Based on what is publicly documented about each,</w:t>
+      </w:r>
+      <w:r>
+        <w:t xml:space="preserve"> </w:t>
+      </w:r>
+      <w:r>
+        <w:rPr>
+          <w:bCs/>
+          <w:b/>
+        </w:rPr>
+        <w:t xml:space="preserve">neither combines a</w:t>
+      </w:r>
+      <w:r>
+        <w:rPr>
+          <w:bCs/>
+          <w:b/>
+        </w:rPr>
+        <w:t xml:space="preserve"> </w:t>
+      </w:r>
+      <w:r>
+        <w:rPr>
+          <w:bCs/>
+          <w:b/>
+        </w:rPr>
+        <w:t xml:space="preserve">calibrated real-city simulation, cloud-based persistent storage, and a dashboard with</w:t>
+      </w:r>
+      <w:r>
+        <w:rPr>
+          <w:bCs/>
+          <w:b/>
+        </w:rPr>
+        <w:t xml:space="preserve"> </w:t>
+      </w:r>
+      <w:r>
+        <w:rPr>
+          <w:bCs/>
+          <w:b/>
+        </w:rPr>
+        <w:t xml:space="preserve">decision-support features in one system.</w:t>
+      </w:r>
+      <w:r>
+        <w:t xml:space="preserve"> </w:t>
+      </w:r>
+      <w:r>
+        <w:t xml:space="preserve">This project's contribution is combining these</w:t>
+      </w:r>
+      <w:r>
+        <w:t xml:space="preserve"> </w:t>
+      </w:r>
+      <w:r>
+        <w:t xml:space="preserve">three elements rather than any one of them in isolation. The decision-support set was</w:t>
+      </w:r>
+      <w:r>
+        <w:t xml:space="preserve"> </w:t>
+      </w:r>
+      <w:r>
+        <w:t xml:space="preserve">further sharpened during delivery toward what-if incident analysis (§2.1), which neither</w:t>
+      </w:r>
+      <w:r>
+        <w:t xml:space="preserve"> </w:t>
+      </w:r>
+      <w:r>
+        <w:t xml:space="preserve">comparable system offers.</w:t>
+      </w:r>
+    </w:p>
+    <w:p>
+      <w:r>
+        <w:pict>
+          <v:rect style="width:0;height:1.5pt" o:hralign="center" o:hrstd="t" o:hr="t"/>
+        </w:pict>
+      </w:r>
+    </w:p>
+    <w:bookmarkEnd w:id="29"/>
+    <w:bookmarkEnd w:id="30"/>
+    <w:bookmarkStart w:id="38" w:name="X167a2da0345881bf36eef0606d50b1063a572d3"/>
+    <w:p>
+      <w:pPr>
+        <w:pStyle w:val="Heading1"/>
+      </w:pPr>
+      <w:r>
+        <w:t xml:space="preserve">3. METHODS</w:t>
+      </w:r>
+    </w:p>
+    <w:bookmarkStart w:id="31" w:name="X90037fffeb0517eb9be28959be4b42079adccec"/>
+    <w:p>
+      <w:pPr>
+        <w:pStyle w:val="Heading2"/>
+      </w:pPr>
+      <w:r>
+        <w:t xml:space="preserve">3.1. Overview</w:t>
+      </w:r>
+    </w:p>
+    <w:p>
+      <w:pPr>
+        <w:pStyle w:val="FirstParagraph"/>
+      </w:pPr>
+      <w:r>
+        <w:rPr>
+          <w:bCs/>
+          <w:b/>
+        </w:rPr>
+        <w:t xml:space="preserve">Methodology — proof of concept.</w:t>
+      </w:r>
+      <w:r>
+        <w:t xml:space="preserve"> </w:t>
+      </w:r>
+      <w:r>
+        <w:t xml:space="preserve">The project was developed as a</w:t>
+      </w:r>
+      <w:r>
+        <w:t xml:space="preserve"> </w:t>
+      </w:r>
+      <w:r>
+        <w:rPr>
+          <w:bCs/>
+          <w:b/>
+        </w:rPr>
+        <w:t xml:space="preserve">proof of concept</w:t>
+      </w:r>
+      <w:r>
+        <w:rPr>
+          <w:bCs/>
+          <w:b/>
+        </w:rPr>
+        <w:t xml:space="preserve"> </w:t>
+      </w:r>
+      <w:r>
+        <w:rPr>
+          <w:bCs/>
+          <w:b/>
+        </w:rPr>
+        <w:t xml:space="preserve">(PoC)</w:t>
+      </w:r>
+      <w:r>
+        <w:t xml:space="preserve">: its purpose is to demonstrate, end-to-end, the</w:t>
+      </w:r>
+      <w:r>
+        <w:t xml:space="preserve"> </w:t>
+      </w:r>
+      <w:r>
+        <w:rPr>
+          <w:iCs/>
+          <w:i/>
+        </w:rPr>
+        <w:t xml:space="preserve">feasibility</w:t>
+      </w:r>
+      <w:r>
+        <w:t xml:space="preserve"> </w:t>
+      </w:r>
+      <w:r>
+        <w:t xml:space="preserve">of a cloud-connected</w:t>
+      </w:r>
+      <w:r>
+        <w:t xml:space="preserve"> </w:t>
+      </w:r>
+      <w:r>
+        <w:t xml:space="preserve">decision-support traffic digital twin — not to deliver a production-hardened system. A PoC</w:t>
+      </w:r>
+      <w:r>
+        <w:t xml:space="preserve"> </w:t>
+      </w:r>
+      <w:r>
+        <w:t xml:space="preserve">approach was appropriate because the contribution is a</w:t>
+      </w:r>
+      <w:r>
+        <w:t xml:space="preserve"> </w:t>
+      </w:r>
+      <w:r>
+        <w:rPr>
+          <w:bCs/>
+          <w:b/>
+        </w:rPr>
+        <w:t xml:space="preserve">novel combination</w:t>
+      </w:r>
+      <w:r>
+        <w:t xml:space="preserve"> </w:t>
+      </w:r>
+      <w:r>
+        <w:t xml:space="preserve">of pieces that</w:t>
+      </w:r>
+      <w:r>
+        <w:t xml:space="preserve"> </w:t>
+      </w:r>
+      <w:r>
+        <w:t xml:space="preserve">exist only separately (a calibrated real-city SUMO simulation, a serverless cloud pipeline,</w:t>
+      </w:r>
+      <w:r>
+        <w:t xml:space="preserve"> </w:t>
+      </w:r>
+      <w:r>
+        <w:t xml:space="preserve">and a decision-support dashboard — see §2.2), so the first question to answer is "can these</w:t>
+      </w:r>
+      <w:r>
+        <w:t xml:space="preserve"> </w:t>
+      </w:r>
+      <w:r>
+        <w:t xml:space="preserve">be made to work together, reliably, at the required latency, within a student budget?".</w:t>
+      </w:r>
+      <w:r>
+        <w:t xml:space="preserve"> </w:t>
+      </w:r>
+      <w:r>
+        <w:t xml:space="preserve">The PoC is therefore deliberately</w:t>
+      </w:r>
+      <w:r>
+        <w:t xml:space="preserve"> </w:t>
+      </w:r>
+      <w:r>
+        <w:rPr>
+          <w:bCs/>
+          <w:b/>
+        </w:rPr>
+        <w:t xml:space="preserve">scoped</w:t>
+      </w:r>
+      <w:r>
+        <w:t xml:space="preserve">: incidents are synthetic (what-if</w:t>
+      </w:r>
+      <w:r>
+        <w:t xml:space="preserve"> </w:t>
+      </w:r>
+      <w:r>
+        <w:t xml:space="preserve">perturbations, not live sensor data), the cloud runs on free-tier / on-demand resources,</w:t>
+      </w:r>
+      <w:r>
+        <w:t xml:space="preserve"> </w:t>
+      </w:r>
+      <w:r>
+        <w:t xml:space="preserve">and some paths are demo-grade rather than fully productionised (see §5.3 Limitations). It</w:t>
+      </w:r>
+      <w:r>
+        <w:t xml:space="preserve"> </w:t>
+      </w:r>
+      <w:r>
+        <w:t xml:space="preserve">is nonetheless a</w:t>
+      </w:r>
+      <w:r>
+        <w:t xml:space="preserve"> </w:t>
+      </w:r>
+      <w:r>
+        <w:rPr>
+          <w:bCs/>
+          <w:b/>
+        </w:rPr>
+        <w:t xml:space="preserve">working, deployed and tested</w:t>
+      </w:r>
+      <w:r>
+        <w:t xml:space="preserve"> </w:t>
+      </w:r>
+      <w:r>
+        <w:t xml:space="preserve">implementation, so it proves the concept</w:t>
+      </w:r>
+      <w:r>
+        <w:t xml:space="preserve"> </w:t>
+      </w:r>
+      <w:r>
+        <w:t xml:space="preserve">rather than merely describing it. Success is judged by the proof-of-concept criteria in</w:t>
+      </w:r>
+      <w:r>
+        <w:t xml:space="preserve"> </w:t>
+      </w:r>
+      <w:r>
+        <w:t xml:space="preserve">§2.1 (the pipeline works end-to-end, an injected incident produces a measurable impact, and</w:t>
+      </w:r>
+      <w:r>
+        <w:t xml:space="preserve"> </w:t>
+      </w:r>
+      <w:r>
+        <w:t xml:space="preserve">the stack is reproducibly deployable).</w:t>
+      </w:r>
+    </w:p>
+    <w:p>
+      <w:pPr>
+        <w:pStyle w:val="BodyText"/>
+      </w:pPr>
+      <w:r>
+        <w:rPr>
+          <w:bCs/>
+          <w:b/>
+        </w:rPr>
+        <w:t xml:space="preserve">Development process.</w:t>
+      </w:r>
+      <w:r>
+        <w:t xml:space="preserve"> </w:t>
+      </w:r>
+      <w:r>
+        <w:t xml:space="preserve">Within that PoC, the build followed a</w:t>
+      </w:r>
+      <w:r>
+        <w:t xml:space="preserve"> </w:t>
+      </w:r>
+      <w:r>
+        <w:rPr>
+          <w:bCs/>
+          <w:b/>
+        </w:rPr>
+        <w:t xml:space="preserve">lightweight, iterative</w:t>
+      </w:r>
+      <w:r>
+        <w:rPr>
+          <w:bCs/>
+          <w:b/>
+        </w:rPr>
+        <w:t xml:space="preserve"> </w:t>
+      </w:r>
+      <w:r>
+        <w:rPr>
+          <w:bCs/>
+          <w:b/>
+        </w:rPr>
+        <w:t xml:space="preserve">approach inspired by Scrum / agile</w:t>
+      </w:r>
+      <w:r>
+        <w:t xml:space="preserve">, rather than formal Scrum with a dedicated</w:t>
+      </w:r>
+      <w:r>
+        <w:t xml:space="preserve"> </w:t>
+      </w:r>
+      <w:r>
+        <w:t xml:space="preserve">project-management tool. The five milestones (§2.1) acted as iterations: each began by</w:t>
+      </w:r>
+      <w:r>
+        <w:t xml:space="preserve"> </w:t>
+      </w:r>
+      <w:r>
+        <w:t xml:space="preserve">breaking the milestone into tasks, proceeded through build-and-test, and ended by</w:t>
+      </w:r>
+      <w:r>
+        <w:t xml:space="preserve"> </w:t>
+      </w:r>
+      <w:r>
+        <w:t xml:space="preserve">demonstrating the working increment to the supervisor at a milestone review and adjusting</w:t>
+      </w:r>
+      <w:r>
+        <w:t xml:space="preserve"> </w:t>
+      </w:r>
+      <w:r>
+        <w:t xml:space="preserve">the plan for the next iteration. As a solo developer there were no formal Scrum ceremonies</w:t>
+      </w:r>
+      <w:r>
+        <w:t xml:space="preserve"> </w:t>
+      </w:r>
+      <w:r>
+        <w:t xml:space="preserve">or roles and</w:t>
+      </w:r>
+      <w:r>
+        <w:t xml:space="preserve"> </w:t>
+      </w:r>
+      <w:r>
+        <w:rPr>
+          <w:bCs/>
+          <w:b/>
+        </w:rPr>
+        <w:t xml:space="preserve">no issue-tracker such as Jira</w:t>
+      </w:r>
+      <w:r>
+        <w:t xml:space="preserve">; instead the task list, design decisions and</w:t>
+      </w:r>
+      <w:r>
+        <w:t xml:space="preserve"> </w:t>
+      </w:r>
+      <w:r>
+        <w:t xml:space="preserve">a running hour budget were tracked in the repository itself (</w:t>
+      </w:r>
+      <w:r>
+        <w:rPr>
+          <w:rStyle w:val="VerbatimChar"/>
+        </w:rPr>
+        <w:t xml:space="preserve">CLAUDE.md</w:t>
+      </w:r>
+      <w:r>
+        <w:t xml:space="preserve">,</w:t>
+      </w:r>
+      <w:r>
+        <w:t xml:space="preserve"> </w:t>
+      </w:r>
+      <w:r>
+        <w:rPr>
+          <w:rStyle w:val="VerbatimChar"/>
+        </w:rPr>
+        <w:t xml:space="preserve">CHECKLIST.md</w:t>
+      </w:r>
+      <w:r>
+        <w:t xml:space="preserve">)</w:t>
+      </w:r>
+      <w:r>
+        <w:t xml:space="preserve"> </w:t>
+      </w:r>
+      <w:r>
+        <w:t xml:space="preserve">and in weekly journals. This plan–build–review–adjust cycle suited a project where each</w:t>
+      </w:r>
+      <w:r>
+        <w:t xml:space="preserve"> </w:t>
+      </w:r>
+      <w:r>
+        <w:t xml:space="preserve">milestone delivers a demonstrable increment that benefits from feedback before the next</w:t>
+      </w:r>
+      <w:r>
+        <w:t xml:space="preserve"> </w:t>
+      </w:r>
+      <w:r>
+        <w:t xml:space="preserve">layer is built on it.</w:t>
+      </w:r>
+    </w:p>
+    <w:p>
+      <w:pPr>
+        <w:pStyle w:val="BodyText"/>
+      </w:pPr>
+      <w:r>
+        <w:rPr>
+          <w:bCs/>
+          <w:b/>
+        </w:rPr>
+        <w:t xml:space="preserve">Techniques and methods.</w:t>
       </w:r>
     </w:p>
     <w:p>
@@ -1745,13 +2498,29 @@
         <w:pStyle w:val="Compact"/>
       </w:pPr>
       <w:r>
-        <w:t xml:space="preserve">End-to-end pipeline latency measured and reported (target: sub-second from simulation</w:t>
-      </w:r>
-      <w:r>
-        <w:t xml:space="preserve"> </w:t>
-      </w:r>
-      <w:r>
-        <w:t xml:space="preserve">step to dashboard update).</w:t>
+        <w:rPr>
+          <w:bCs/>
+          <w:b/>
+        </w:rPr>
+        <w:t xml:space="preserve">Vertical-slice-first development</w:t>
+      </w:r>
+      <w:r>
+        <w:t xml:space="preserve"> </w:t>
+      </w:r>
+      <w:r>
+        <w:t xml:space="preserve">— build one intersection's worth of streaming,</w:t>
+      </w:r>
+      <w:r>
+        <w:t xml:space="preserve"> </w:t>
+      </w:r>
+      <w:r>
+        <w:t xml:space="preserve">storage and dashboard display end-to-end before widening coverage, so integration risk</w:t>
+      </w:r>
+      <w:r>
+        <w:t xml:space="preserve"> </w:t>
+      </w:r>
+      <w:r>
+        <w:t xml:space="preserve">is found early (M1–M3).</w:t>
       </w:r>
     </w:p>
     <w:p>
@@ -1763,7 +2532,23 @@
         <w:pStyle w:val="Compact"/>
       </w:pPr>
       <w:r>
-        <w:t xml:space="preserve">All five sub-goals demonstrated working in a single recorded run.</w:t>
+        <w:rPr>
+          <w:bCs/>
+          <w:b/>
+        </w:rPr>
+        <w:t xml:space="preserve">Infrastructure-as-code</w:t>
+      </w:r>
+      <w:r>
+        <w:t xml:space="preserve"> </w:t>
+      </w:r>
+      <w:r>
+        <w:t xml:space="preserve">— all AWS resources defined and provisioned through Terraform,</w:t>
+      </w:r>
+      <w:r>
+        <w:t xml:space="preserve"> </w:t>
+      </w:r>
+      <w:r>
+        <w:t xml:space="preserve">so the cloud environment is reproducible and reviewable as code (M2).</w:t>
       </w:r>
     </w:p>
     <w:p>
@@ -1775,7 +2560,62 @@
         <w:pStyle w:val="Compact"/>
       </w:pPr>
       <w:r>
-        <w:t xml:space="preserve">Terraform able to reprovision the full AWS stack from a clean account.</w:t>
+        <w:rPr>
+          <w:bCs/>
+          <w:b/>
+        </w:rPr>
+        <w:t xml:space="preserve">Incremental, additive extension of existing files</w:t>
+      </w:r>
+      <w:r>
+        <w:t xml:space="preserve"> </w:t>
+      </w:r>
+      <w:r>
+        <w:t xml:space="preserve">— the existing simulation core,</w:t>
+      </w:r>
+      <w:r>
+        <w:t xml:space="preserve"> </w:t>
+      </w:r>
+      <w:r>
+        <w:t xml:space="preserve">network and demand files are not modified; new functionality is added at the two</w:t>
+      </w:r>
+      <w:r>
+        <w:t xml:space="preserve"> </w:t>
+      </w:r>
+      <w:r>
+        <w:t xml:space="preserve">confirmed extension points (the TraCI step hook in</w:t>
+      </w:r>
+      <w:r>
+        <w:t xml:space="preserve"> </w:t>
+      </w:r>
+      <w:r>
+        <w:rPr>
+          <w:rStyle w:val="VerbatimChar"/>
+        </w:rPr>
+        <w:t xml:space="preserve">run_traci.py</w:t>
+      </w:r>
+      <w:r>
+        <w:t xml:space="preserve"> </w:t>
+      </w:r>
+      <w:r>
+        <w:t xml:space="preserve">and the map's</w:t>
+      </w:r>
+      <w:r>
+        <w:t xml:space="preserve"> </w:t>
+      </w:r>
+      <w:r>
+        <w:t xml:space="preserve">data-loading logic in</w:t>
+      </w:r>
+      <w:r>
+        <w:t xml:space="preserve"> </w:t>
+      </w:r>
+      <w:r>
+        <w:rPr>
+          <w:rStyle w:val="VerbatimChar"/>
+        </w:rPr>
+        <w:t xml:space="preserve">intersection_map.html</w:t>
+      </w:r>
+      <w:r>
+        <w:t xml:space="preserve">) (M1, M3).</w:t>
       </w:r>
     </w:p>
     <w:p>
@@ -1783,873 +2623,6 @@
         <w:numPr>
           <w:ilvl w:val="0"/>
           <w:numId w:val="1002"/>
-        </w:numPr>
-        <w:pStyle w:val="Compact"/>
-      </w:pPr>
-      <w:r>
-        <w:t xml:space="preserve">Supervisor sign-off on a live demonstration of each decision-support feature.</w:t>
-      </w:r>
-    </w:p>
-    <w:p>
-      <w:pPr>
-        <w:numPr>
-          <w:ilvl w:val="0"/>
-          <w:numId w:val="1002"/>
-        </w:numPr>
-        <w:pStyle w:val="Compact"/>
-      </w:pPr>
-      <w:r>
-        <w:t xml:space="preserve">Final report submitted evaluating the system against these goals.</w:t>
-      </w:r>
-    </w:p>
-    <w:p>
-      <w:pPr>
-        <w:pStyle w:val="FirstParagraph"/>
-      </w:pPr>
-      <w:r>
-        <w:rPr>
-          <w:bCs/>
-          <w:b/>
-        </w:rPr>
-        <w:t xml:space="preserve">Evolution during delivery.</w:t>
-      </w:r>
-      <w:r>
-        <w:t xml:space="preserve"> </w:t>
-      </w:r>
-      <w:r>
-        <w:t xml:space="preserve">Milestone 4 was committed as "at least four</w:t>
-      </w:r>
-      <w:r>
-        <w:t xml:space="preserve"> </w:t>
-      </w:r>
-      <w:r>
-        <w:t xml:space="preserve">decision-support features." During delivery the</w:t>
-      </w:r>
-      <w:r>
-        <w:t xml:space="preserve"> </w:t>
-      </w:r>
-      <w:r>
-        <w:rPr>
-          <w:iCs/>
-          <w:i/>
-        </w:rPr>
-        <w:t xml:space="preserve">specific set</w:t>
-      </w:r>
-      <w:r>
-        <w:t xml:space="preserve"> </w:t>
-      </w:r>
-      <w:r>
-        <w:t xml:space="preserve">evolved from the</w:t>
-      </w:r>
-      <w:r>
-        <w:t xml:space="preserve"> </w:t>
-      </w:r>
-      <w:r>
-        <w:t xml:space="preserve">originally-listed features toward stronger</w:t>
-      </w:r>
-      <w:r>
-        <w:t xml:space="preserve"> </w:t>
-      </w:r>
-      <w:r>
-        <w:rPr>
-          <w:bCs/>
-          <w:b/>
-        </w:rPr>
-        <w:t xml:space="preserve">what-if decision support</w:t>
-      </w:r>
-      <w:r>
-        <w:t xml:space="preserve"> </w:t>
-      </w:r>
-      <w:r>
-        <w:t xml:space="preserve">on the calibrated</w:t>
-      </w:r>
-      <w:r>
-        <w:t xml:space="preserve"> </w:t>
-      </w:r>
-      <w:r>
-        <w:t xml:space="preserve">model: congestion alerts and scenario comparison were kept, incident injection, live</w:t>
-      </w:r>
-      <w:r>
-        <w:t xml:space="preserve"> </w:t>
-      </w:r>
-      <w:r>
-        <w:t xml:space="preserve">click-to-inject and an impact report were added, while historical replay was</w:t>
-      </w:r>
-      <w:r>
-        <w:t xml:space="preserve"> </w:t>
-      </w:r>
-      <w:r>
-        <w:t xml:space="preserve">de-prioritised (the real-data counts path became the comparison</w:t>
-      </w:r>
-      <w:r>
-        <w:t xml:space="preserve"> </w:t>
-      </w:r>
-      <w:r>
-        <w:rPr>
-          <w:bCs/>
-          <w:b/>
-        </w:rPr>
-        <w:t xml:space="preserve">baseline</w:t>
-      </w:r>
-      <w:r>
-        <w:t xml:space="preserve"> </w:t>
-      </w:r>
-      <w:r>
-        <w:t xml:space="preserve">rather than a</w:t>
-      </w:r>
-      <w:r>
-        <w:t xml:space="preserve"> </w:t>
-      </w:r>
-      <w:r>
-        <w:t xml:space="preserve">headline feature) and the threshold-metrics idea was folded into the congestion overlay.</w:t>
-      </w:r>
-      <w:r>
-        <w:t xml:space="preserve"> </w:t>
-      </w:r>
-      <w:r>
-        <w:t xml:space="preserve">The "≥ 4 decision-support features" requirement is therefore met, with a set better</w:t>
-      </w:r>
-      <w:r>
-        <w:t xml:space="preserve"> </w:t>
-      </w:r>
-      <w:r>
-        <w:t xml:space="preserve">aligned to the purpose of a digital twin (see §3.3 and §5.1).</w:t>
-      </w:r>
-    </w:p>
-    <w:bookmarkEnd w:id="28"/>
-    <w:bookmarkStart w:id="29" w:name="Xd6b45fcf3330aa915fa26f3cc215d0e4ed00491"/>
-    <w:p>
-      <w:pPr>
-        <w:pStyle w:val="Heading2"/>
-      </w:pPr>
-      <w:r>
-        <w:t xml:space="preserve">2.2. Comparative Analysis</w:t>
-      </w:r>
-    </w:p>
-    <w:p>
-      <w:pPr>
-        <w:pStyle w:val="FirstParagraph"/>
-      </w:pPr>
-      <w:r>
-        <w:rPr>
-          <w:iCs/>
-          <w:i/>
-        </w:rPr>
-        <w:t xml:space="preserve">(Extended from the comparative study in the proposal.)</w:t>
-      </w:r>
-    </w:p>
-    <w:p>
-      <w:pPr>
-        <w:pStyle w:val="BodyText"/>
-      </w:pPr>
-      <w:r>
-        <w:t xml:space="preserve">Two publicly-documented systems are directly comparable, based on what each documents</w:t>
-      </w:r>
-      <w:r>
-        <w:t xml:space="preserve"> </w:t>
-      </w:r>
-      <w:r>
-        <w:t xml:space="preserve">about itself.</w:t>
-      </w:r>
-    </w:p>
-    <w:p>
-      <w:pPr>
-        <w:pStyle w:val="BodyText"/>
-      </w:pPr>
-      <w:r>
-        <w:t xml:space="preserve">The first is an</w:t>
-      </w:r>
-      <w:r>
-        <w:t xml:space="preserve"> </w:t>
-      </w:r>
-      <w:r>
-        <w:rPr>
-          <w:bCs/>
-          <w:b/>
-        </w:rPr>
-        <w:t xml:space="preserve">open-source SUMO traffic dashboard built with FastAPI and TraCI</w:t>
-      </w:r>
-      <w:r>
-        <w:t xml:space="preserve"> </w:t>
-      </w:r>
-      <w:r>
-        <w:t xml:space="preserve">(keshu-bara, 2025), which already provides live vehicle tracking and congestion detection</w:t>
-      </w:r>
-      <w:r>
-        <w:t xml:space="preserve"> </w:t>
-      </w:r>
-      <w:r>
-        <w:t xml:space="preserve">from a running SUMO simulation. However, by its own documentation it runs entirely on a</w:t>
-      </w:r>
-      <w:r>
-        <w:t xml:space="preserve"> </w:t>
-      </w:r>
-      <w:r>
-        <w:t xml:space="preserve">single machine, updates the browser by</w:t>
-      </w:r>
-      <w:r>
-        <w:t xml:space="preserve"> </w:t>
-      </w:r>
-      <w:r>
-        <w:rPr>
-          <w:iCs/>
-          <w:i/>
-        </w:rPr>
-        <w:t xml:space="preserve">polling</w:t>
-      </w:r>
-      <w:r>
-        <w:t xml:space="preserve"> </w:t>
-      </w:r>
-      <w:r>
-        <w:t xml:space="preserve">rather than genuine streaming, and does</w:t>
-      </w:r>
-      <w:r>
-        <w:t xml:space="preserve"> </w:t>
-      </w:r>
-      <w:r>
-        <w:t xml:space="preserve">not persist data to a database; historical replay is listed only as a planned future</w:t>
-      </w:r>
-      <w:r>
-        <w:t xml:space="preserve"> </w:t>
-      </w:r>
-      <w:r>
-        <w:t xml:space="preserve">feature, not something currently implemented.</w:t>
-      </w:r>
-    </w:p>
-    <w:p>
-      <w:pPr>
-        <w:pStyle w:val="BodyText"/>
-      </w:pPr>
-      <w:r>
-        <w:t xml:space="preserve">The second is a</w:t>
-      </w:r>
-      <w:r>
-        <w:t xml:space="preserve"> </w:t>
-      </w:r>
-      <w:r>
-        <w:rPr>
-          <w:bCs/>
-          <w:b/>
-        </w:rPr>
-        <w:t xml:space="preserve">peer-reviewed cloud architecture that streams SUMO simulation data</w:t>
-      </w:r>
-      <w:r>
-        <w:rPr>
-          <w:bCs/>
-          <w:b/>
-        </w:rPr>
-        <w:t xml:space="preserve"> </w:t>
-      </w:r>
-      <w:r>
-        <w:rPr>
-          <w:bCs/>
-          <w:b/>
-        </w:rPr>
-        <w:t xml:space="preserve">through a serverless AWS pipeline</w:t>
-      </w:r>
-      <w:r>
-        <w:t xml:space="preserve"> </w:t>
-      </w:r>
-      <w:r>
-        <w:t xml:space="preserve">to support a real-time vehicle speed-advisory</w:t>
-      </w:r>
-      <w:r>
-        <w:t xml:space="preserve"> </w:t>
-      </w:r>
-      <w:r>
-        <w:t xml:space="preserve">application (Deng et al., 2024). This shows that an AWS-based, SUMO-driven streaming</w:t>
-      </w:r>
-      <w:r>
-        <w:t xml:space="preserve"> </w:t>
-      </w:r>
-      <w:r>
-        <w:t xml:space="preserve">architecture is viable at a latency requirement similar to the one this project targets.</w:t>
-      </w:r>
-      <w:r>
-        <w:t xml:space="preserve"> </w:t>
-      </w:r>
-      <w:r>
-        <w:t xml:space="preserve">However, the published system was built to evaluate a specific control algorithm rather</w:t>
-      </w:r>
-      <w:r>
-        <w:t xml:space="preserve"> </w:t>
-      </w:r>
-      <w:r>
-        <w:t xml:space="preserve">than to serve as a general-purpose dashboard, and it does not include decision-support</w:t>
-      </w:r>
-      <w:r>
-        <w:t xml:space="preserve"> </w:t>
-      </w:r>
-      <w:r>
-        <w:t xml:space="preserve">features such as alerts, scenario comparison, or historical replay.</w:t>
-      </w:r>
-    </w:p>
-    <w:p>
-      <w:pPr>
-        <w:pStyle w:val="BodyText"/>
-      </w:pPr>
-      <w:r>
-        <w:t xml:space="preserve">Between them, these two systems indicate that the individual pieces of this project — a</w:t>
-      </w:r>
-      <w:r>
-        <w:t xml:space="preserve"> </w:t>
-      </w:r>
-      <w:r>
-        <w:t xml:space="preserve">SUMO dashboard with live tracking, and an AWS-based SUMO streaming pipeline — already</w:t>
-      </w:r>
-      <w:r>
-        <w:t xml:space="preserve"> </w:t>
-      </w:r>
-      <w:r>
-        <w:t xml:space="preserve">exist separately. Based on what is publicly documented about each,</w:t>
-      </w:r>
-      <w:r>
-        <w:t xml:space="preserve"> </w:t>
-      </w:r>
-      <w:r>
-        <w:rPr>
-          <w:bCs/>
-          <w:b/>
-        </w:rPr>
-        <w:t xml:space="preserve">neither combines a</w:t>
-      </w:r>
-      <w:r>
-        <w:rPr>
-          <w:bCs/>
-          <w:b/>
-        </w:rPr>
-        <w:t xml:space="preserve"> </w:t>
-      </w:r>
-      <w:r>
-        <w:rPr>
-          <w:bCs/>
-          <w:b/>
-        </w:rPr>
-        <w:t xml:space="preserve">calibrated real-city simulation, cloud-based persistent storage, and a dashboard with</w:t>
-      </w:r>
-      <w:r>
-        <w:rPr>
-          <w:bCs/>
-          <w:b/>
-        </w:rPr>
-        <w:t xml:space="preserve"> </w:t>
-      </w:r>
-      <w:r>
-        <w:rPr>
-          <w:bCs/>
-          <w:b/>
-        </w:rPr>
-        <w:t xml:space="preserve">decision-support features in one system.</w:t>
-      </w:r>
-      <w:r>
-        <w:t xml:space="preserve"> </w:t>
-      </w:r>
-      <w:r>
-        <w:t xml:space="preserve">This project's contribution is combining these</w:t>
-      </w:r>
-      <w:r>
-        <w:t xml:space="preserve"> </w:t>
-      </w:r>
-      <w:r>
-        <w:t xml:space="preserve">three elements rather than any one of them in isolation. The decision-support set was</w:t>
-      </w:r>
-      <w:r>
-        <w:t xml:space="preserve"> </w:t>
-      </w:r>
-      <w:r>
-        <w:t xml:space="preserve">further sharpened during delivery toward what-if incident analysis (§2.1), which neither</w:t>
-      </w:r>
-      <w:r>
-        <w:t xml:space="preserve"> </w:t>
-      </w:r>
-      <w:r>
-        <w:t xml:space="preserve">comparable system offers.</w:t>
-      </w:r>
-    </w:p>
-    <w:p>
-      <w:r>
-        <w:pict>
-          <v:rect style="width:0;height:1.5pt" o:hralign="center" o:hrstd="t" o:hr="t"/>
-        </w:pict>
-      </w:r>
-    </w:p>
-    <w:bookmarkEnd w:id="29"/>
-    <w:bookmarkEnd w:id="30"/>
-    <w:bookmarkStart w:id="38" w:name="X167a2da0345881bf36eef0606d50b1063a572d3"/>
-    <w:p>
-      <w:pPr>
-        <w:pStyle w:val="Heading1"/>
-      </w:pPr>
-      <w:r>
-        <w:t xml:space="preserve">3. METHODS</w:t>
-      </w:r>
-    </w:p>
-    <w:bookmarkStart w:id="31" w:name="X90037fffeb0517eb9be28959be4b42079adccec"/>
-    <w:p>
-      <w:pPr>
-        <w:pStyle w:val="Heading2"/>
-      </w:pPr>
-      <w:r>
-        <w:t xml:space="preserve">3.1. Overview</w:t>
-      </w:r>
-    </w:p>
-    <w:p>
-      <w:pPr>
-        <w:pStyle w:val="FirstParagraph"/>
-      </w:pPr>
-      <w:r>
-        <w:rPr>
-          <w:bCs/>
-          <w:b/>
-        </w:rPr>
-        <w:t xml:space="preserve">Methodology — proof of concept.</w:t>
-      </w:r>
-      <w:r>
-        <w:t xml:space="preserve"> </w:t>
-      </w:r>
-      <w:r>
-        <w:t xml:space="preserve">The project was developed as a</w:t>
-      </w:r>
-      <w:r>
-        <w:t xml:space="preserve"> </w:t>
-      </w:r>
-      <w:r>
-        <w:rPr>
-          <w:bCs/>
-          <w:b/>
-        </w:rPr>
-        <w:t xml:space="preserve">proof of concept</w:t>
-      </w:r>
-      <w:r>
-        <w:rPr>
-          <w:bCs/>
-          <w:b/>
-        </w:rPr>
-        <w:t xml:space="preserve"> </w:t>
-      </w:r>
-      <w:r>
-        <w:rPr>
-          <w:bCs/>
-          <w:b/>
-        </w:rPr>
-        <w:t xml:space="preserve">(PoC)</w:t>
-      </w:r>
-      <w:r>
-        <w:t xml:space="preserve">: its purpose is to demonstrate, end-to-end, the</w:t>
-      </w:r>
-      <w:r>
-        <w:t xml:space="preserve"> </w:t>
-      </w:r>
-      <w:r>
-        <w:rPr>
-          <w:iCs/>
-          <w:i/>
-        </w:rPr>
-        <w:t xml:space="preserve">feasibility</w:t>
-      </w:r>
-      <w:r>
-        <w:t xml:space="preserve"> </w:t>
-      </w:r>
-      <w:r>
-        <w:t xml:space="preserve">of a cloud-connected</w:t>
-      </w:r>
-      <w:r>
-        <w:t xml:space="preserve"> </w:t>
-      </w:r>
-      <w:r>
-        <w:t xml:space="preserve">decision-support traffic digital twin — not to deliver a production-hardened system. A PoC</w:t>
-      </w:r>
-      <w:r>
-        <w:t xml:space="preserve"> </w:t>
-      </w:r>
-      <w:r>
-        <w:t xml:space="preserve">approach was appropriate because the contribution is a</w:t>
-      </w:r>
-      <w:r>
-        <w:t xml:space="preserve"> </w:t>
-      </w:r>
-      <w:r>
-        <w:rPr>
-          <w:bCs/>
-          <w:b/>
-        </w:rPr>
-        <w:t xml:space="preserve">novel combination</w:t>
-      </w:r>
-      <w:r>
-        <w:t xml:space="preserve"> </w:t>
-      </w:r>
-      <w:r>
-        <w:t xml:space="preserve">of pieces that</w:t>
-      </w:r>
-      <w:r>
-        <w:t xml:space="preserve"> </w:t>
-      </w:r>
-      <w:r>
-        <w:t xml:space="preserve">exist only separately (a calibrated real-city SUMO simulation, a serverless cloud pipeline,</w:t>
-      </w:r>
-      <w:r>
-        <w:t xml:space="preserve"> </w:t>
-      </w:r>
-      <w:r>
-        <w:t xml:space="preserve">and a decision-support dashboard — see §2.2), so the first question to answer is "can these</w:t>
-      </w:r>
-      <w:r>
-        <w:t xml:space="preserve"> </w:t>
-      </w:r>
-      <w:r>
-        <w:t xml:space="preserve">be made to work together, reliably, at the required latency, within a student budget?".</w:t>
-      </w:r>
-      <w:r>
-        <w:t xml:space="preserve"> </w:t>
-      </w:r>
-      <w:r>
-        <w:t xml:space="preserve">The PoC is therefore deliberately</w:t>
-      </w:r>
-      <w:r>
-        <w:t xml:space="preserve"> </w:t>
-      </w:r>
-      <w:r>
-        <w:rPr>
-          <w:bCs/>
-          <w:b/>
-        </w:rPr>
-        <w:t xml:space="preserve">scoped</w:t>
-      </w:r>
-      <w:r>
-        <w:t xml:space="preserve">: incidents are synthetic (what-if</w:t>
-      </w:r>
-      <w:r>
-        <w:t xml:space="preserve"> </w:t>
-      </w:r>
-      <w:r>
-        <w:t xml:space="preserve">perturbations, not live sensor data), the cloud runs on free-tier / on-demand resources,</w:t>
-      </w:r>
-      <w:r>
-        <w:t xml:space="preserve"> </w:t>
-      </w:r>
-      <w:r>
-        <w:t xml:space="preserve">and some paths are demo-grade rather than fully productionised (see §5.3 Limitations). It</w:t>
-      </w:r>
-      <w:r>
-        <w:t xml:space="preserve"> </w:t>
-      </w:r>
-      <w:r>
-        <w:t xml:space="preserve">is nonetheless a</w:t>
-      </w:r>
-      <w:r>
-        <w:t xml:space="preserve"> </w:t>
-      </w:r>
-      <w:r>
-        <w:rPr>
-          <w:bCs/>
-          <w:b/>
-        </w:rPr>
-        <w:t xml:space="preserve">working, deployed and tested</w:t>
-      </w:r>
-      <w:r>
-        <w:t xml:space="preserve"> </w:t>
-      </w:r>
-      <w:r>
-        <w:t xml:space="preserve">implementation, so it proves the concept</w:t>
-      </w:r>
-      <w:r>
-        <w:t xml:space="preserve"> </w:t>
-      </w:r>
-      <w:r>
-        <w:t xml:space="preserve">rather than merely describing it. Success is judged by the proof-of-concept criteria in</w:t>
-      </w:r>
-      <w:r>
-        <w:t xml:space="preserve"> </w:t>
-      </w:r>
-      <w:r>
-        <w:t xml:space="preserve">§2.1 (the pipeline works end-to-end, an injected incident produces a measurable impact, and</w:t>
-      </w:r>
-      <w:r>
-        <w:t xml:space="preserve"> </w:t>
-      </w:r>
-      <w:r>
-        <w:t xml:space="preserve">the stack is reproducibly deployable).</w:t>
-      </w:r>
-    </w:p>
-    <w:p>
-      <w:pPr>
-        <w:pStyle w:val="BodyText"/>
-      </w:pPr>
-      <w:r>
-        <w:rPr>
-          <w:bCs/>
-          <w:b/>
-        </w:rPr>
-        <w:t xml:space="preserve">Development process.</w:t>
-      </w:r>
-      <w:r>
-        <w:t xml:space="preserve"> </w:t>
-      </w:r>
-      <w:r>
-        <w:t xml:space="preserve">Within that PoC, the build followed a</w:t>
-      </w:r>
-      <w:r>
-        <w:t xml:space="preserve"> </w:t>
-      </w:r>
-      <w:r>
-        <w:rPr>
-          <w:bCs/>
-          <w:b/>
-        </w:rPr>
-        <w:t xml:space="preserve">lightweight, iterative</w:t>
-      </w:r>
-      <w:r>
-        <w:rPr>
-          <w:bCs/>
-          <w:b/>
-        </w:rPr>
-        <w:t xml:space="preserve"> </w:t>
-      </w:r>
-      <w:r>
-        <w:rPr>
-          <w:bCs/>
-          <w:b/>
-        </w:rPr>
-        <w:t xml:space="preserve">approach inspired by Scrum / agile</w:t>
-      </w:r>
-      <w:r>
-        <w:t xml:space="preserve">, rather than formal Scrum with a dedicated</w:t>
-      </w:r>
-      <w:r>
-        <w:t xml:space="preserve"> </w:t>
-      </w:r>
-      <w:r>
-        <w:t xml:space="preserve">project-management tool. The five milestones (§2.1) acted as iterations: each began by</w:t>
-      </w:r>
-      <w:r>
-        <w:t xml:space="preserve"> </w:t>
-      </w:r>
-      <w:r>
-        <w:t xml:space="preserve">breaking the milestone into tasks, proceeded through build-and-test, and ended by</w:t>
-      </w:r>
-      <w:r>
-        <w:t xml:space="preserve"> </w:t>
-      </w:r>
-      <w:r>
-        <w:t xml:space="preserve">demonstrating the working increment to the supervisor at a milestone review and adjusting</w:t>
-      </w:r>
-      <w:r>
-        <w:t xml:space="preserve"> </w:t>
-      </w:r>
-      <w:r>
-        <w:t xml:space="preserve">the plan for the next iteration. As a solo developer there were no formal Scrum ceremonies</w:t>
-      </w:r>
-      <w:r>
-        <w:t xml:space="preserve"> </w:t>
-      </w:r>
-      <w:r>
-        <w:t xml:space="preserve">or roles and</w:t>
-      </w:r>
-      <w:r>
-        <w:t xml:space="preserve"> </w:t>
-      </w:r>
-      <w:r>
-        <w:rPr>
-          <w:bCs/>
-          <w:b/>
-        </w:rPr>
-        <w:t xml:space="preserve">no issue-tracker such as Jira</w:t>
-      </w:r>
-      <w:r>
-        <w:t xml:space="preserve">; instead the task list, design decisions and</w:t>
-      </w:r>
-      <w:r>
-        <w:t xml:space="preserve"> </w:t>
-      </w:r>
-      <w:r>
-        <w:t xml:space="preserve">a running hour budget were tracked in the repository itself (</w:t>
-      </w:r>
-      <w:r>
-        <w:rPr>
-          <w:rStyle w:val="VerbatimChar"/>
-        </w:rPr>
-        <w:t xml:space="preserve">CLAUDE.md</w:t>
-      </w:r>
-      <w:r>
-        <w:t xml:space="preserve">,</w:t>
-      </w:r>
-      <w:r>
-        <w:t xml:space="preserve"> </w:t>
-      </w:r>
-      <w:r>
-        <w:rPr>
-          <w:rStyle w:val="VerbatimChar"/>
-        </w:rPr>
-        <w:t xml:space="preserve">CHECKLIST.md</w:t>
-      </w:r>
-      <w:r>
-        <w:t xml:space="preserve">)</w:t>
-      </w:r>
-      <w:r>
-        <w:t xml:space="preserve"> </w:t>
-      </w:r>
-      <w:r>
-        <w:t xml:space="preserve">and in weekly journals. This plan–build–review–adjust cycle suited a project where each</w:t>
-      </w:r>
-      <w:r>
-        <w:t xml:space="preserve"> </w:t>
-      </w:r>
-      <w:r>
-        <w:t xml:space="preserve">milestone delivers a demonstrable increment that benefits from feedback before the next</w:t>
-      </w:r>
-      <w:r>
-        <w:t xml:space="preserve"> </w:t>
-      </w:r>
-      <w:r>
-        <w:t xml:space="preserve">layer is built on it.</w:t>
-      </w:r>
-    </w:p>
-    <w:p>
-      <w:pPr>
-        <w:pStyle w:val="BodyText"/>
-      </w:pPr>
-      <w:r>
-        <w:rPr>
-          <w:bCs/>
-          <w:b/>
-        </w:rPr>
-        <w:t xml:space="preserve">Techniques and methods.</w:t>
-      </w:r>
-    </w:p>
-    <w:p>
-      <w:pPr>
-        <w:numPr>
-          <w:ilvl w:val="0"/>
-          <w:numId w:val="1003"/>
-        </w:numPr>
-        <w:pStyle w:val="Compact"/>
-      </w:pPr>
-      <w:r>
-        <w:rPr>
-          <w:bCs/>
-          <w:b/>
-        </w:rPr>
-        <w:t xml:space="preserve">Vertical-slice-first development</w:t>
-      </w:r>
-      <w:r>
-        <w:t xml:space="preserve"> </w:t>
-      </w:r>
-      <w:r>
-        <w:t xml:space="preserve">— build one intersection's worth of streaming,</w:t>
-      </w:r>
-      <w:r>
-        <w:t xml:space="preserve"> </w:t>
-      </w:r>
-      <w:r>
-        <w:t xml:space="preserve">storage and dashboard display end-to-end before widening coverage, so integration risk</w:t>
-      </w:r>
-      <w:r>
-        <w:t xml:space="preserve"> </w:t>
-      </w:r>
-      <w:r>
-        <w:t xml:space="preserve">is found early (M1–M3).</w:t>
-      </w:r>
-    </w:p>
-    <w:p>
-      <w:pPr>
-        <w:numPr>
-          <w:ilvl w:val="0"/>
-          <w:numId w:val="1003"/>
-        </w:numPr>
-        <w:pStyle w:val="Compact"/>
-      </w:pPr>
-      <w:r>
-        <w:rPr>
-          <w:bCs/>
-          <w:b/>
-        </w:rPr>
-        <w:t xml:space="preserve">Infrastructure-as-code</w:t>
-      </w:r>
-      <w:r>
-        <w:t xml:space="preserve"> </w:t>
-      </w:r>
-      <w:r>
-        <w:t xml:space="preserve">— all AWS resources defined and provisioned through Terraform,</w:t>
-      </w:r>
-      <w:r>
-        <w:t xml:space="preserve"> </w:t>
-      </w:r>
-      <w:r>
-        <w:t xml:space="preserve">so the cloud environment is reproducible and reviewable as code (M2).</w:t>
-      </w:r>
-    </w:p>
-    <w:p>
-      <w:pPr>
-        <w:numPr>
-          <w:ilvl w:val="0"/>
-          <w:numId w:val="1003"/>
-        </w:numPr>
-        <w:pStyle w:val="Compact"/>
-      </w:pPr>
-      <w:r>
-        <w:rPr>
-          <w:bCs/>
-          <w:b/>
-        </w:rPr>
-        <w:t xml:space="preserve">Incremental, additive extension of existing files</w:t>
-      </w:r>
-      <w:r>
-        <w:t xml:space="preserve"> </w:t>
-      </w:r>
-      <w:r>
-        <w:t xml:space="preserve">— the existing simulation core,</w:t>
-      </w:r>
-      <w:r>
-        <w:t xml:space="preserve"> </w:t>
-      </w:r>
-      <w:r>
-        <w:t xml:space="preserve">network and demand files are not modified; new functionality is added at the two</w:t>
-      </w:r>
-      <w:r>
-        <w:t xml:space="preserve"> </w:t>
-      </w:r>
-      <w:r>
-        <w:t xml:space="preserve">confirmed extension points (the TraCI step hook in</w:t>
-      </w:r>
-      <w:r>
-        <w:t xml:space="preserve"> </w:t>
-      </w:r>
-      <w:r>
-        <w:rPr>
-          <w:rStyle w:val="VerbatimChar"/>
-        </w:rPr>
-        <w:t xml:space="preserve">run_traci.py</w:t>
-      </w:r>
-      <w:r>
-        <w:t xml:space="preserve"> </w:t>
-      </w:r>
-      <w:r>
-        <w:t xml:space="preserve">and the map's</w:t>
-      </w:r>
-      <w:r>
-        <w:t xml:space="preserve"> </w:t>
-      </w:r>
-      <w:r>
-        <w:t xml:space="preserve">data-loading logic in</w:t>
-      </w:r>
-      <w:r>
-        <w:t xml:space="preserve"> </w:t>
-      </w:r>
-      <w:r>
-        <w:rPr>
-          <w:rStyle w:val="VerbatimChar"/>
-        </w:rPr>
-        <w:t xml:space="preserve">intersection_map.html</w:t>
-      </w:r>
-      <w:r>
-        <w:t xml:space="preserve">) (M1, M3).</w:t>
-      </w:r>
-    </w:p>
-    <w:p>
-      <w:pPr>
-        <w:numPr>
-          <w:ilvl w:val="0"/>
-          <w:numId w:val="1003"/>
         </w:numPr>
         <w:pStyle w:val="Compact"/>
       </w:pPr>
@@ -3816,7 +3789,7 @@
       <w:pPr>
         <w:numPr>
           <w:ilvl w:val="0"/>
-          <w:numId w:val="1004"/>
+          <w:numId w:val="1003"/>
         </w:numPr>
         <w:pStyle w:val="Compact"/>
       </w:pPr>
@@ -3874,7 +3847,7 @@
       <w:pPr>
         <w:numPr>
           <w:ilvl w:val="0"/>
-          <w:numId w:val="1004"/>
+          <w:numId w:val="1003"/>
         </w:numPr>
         <w:pStyle w:val="Compact"/>
       </w:pPr>
@@ -3929,7 +3902,7 @@
       <w:pPr>
         <w:numPr>
           <w:ilvl w:val="0"/>
-          <w:numId w:val="1004"/>
+          <w:numId w:val="1003"/>
         </w:numPr>
         <w:pStyle w:val="Compact"/>
       </w:pPr>
@@ -3972,7 +3945,7 @@
       <w:pPr>
         <w:numPr>
           <w:ilvl w:val="0"/>
-          <w:numId w:val="1004"/>
+          <w:numId w:val="1003"/>
         </w:numPr>
         <w:pStyle w:val="Compact"/>
       </w:pPr>
@@ -4024,7 +3997,7 @@
       <w:pPr>
         <w:numPr>
           <w:ilvl w:val="0"/>
-          <w:numId w:val="1004"/>
+          <w:numId w:val="1003"/>
         </w:numPr>
         <w:pStyle w:val="Compact"/>
       </w:pPr>
@@ -5593,7 +5566,7 @@
       <w:pPr>
         <w:numPr>
           <w:ilvl w:val="0"/>
-          <w:numId w:val="1005"/>
+          <w:numId w:val="1004"/>
         </w:numPr>
         <w:pStyle w:val="Compact"/>
       </w:pPr>
@@ -5617,6 +5590,175 @@
           <w:i/>
         </w:rPr>
         <w:t xml:space="preserve">metric panels.</w:t>
+      </w:r>
+    </w:p>
+    <w:p>
+      <w:pPr>
+        <w:numPr>
+          <w:ilvl w:val="0"/>
+          <w:numId w:val="1004"/>
+        </w:numPr>
+        <w:pStyle w:val="Compact"/>
+      </w:pPr>
+      <w:r>
+        <w:rPr>
+          <w:iCs/>
+          <w:i/>
+        </w:rPr>
+        <w:t xml:space="preserve">Figure 3. Compare view — baseline vs incident overlaid for a metric, with the</w:t>
+      </w:r>
+      <w:r>
+        <w:rPr>
+          <w:iCs/>
+          <w:i/>
+        </w:rPr>
+        <w:t xml:space="preserve"> </w:t>
+      </w:r>
+      <w:r>
+        <w:rPr>
+          <w:iCs/>
+          <w:i/>
+        </w:rPr>
+        <w:t xml:space="preserve">quantified summary line.</w:t>
+      </w:r>
+    </w:p>
+    <w:p>
+      <w:pPr>
+        <w:numPr>
+          <w:ilvl w:val="0"/>
+          <w:numId w:val="1004"/>
+        </w:numPr>
+        <w:pStyle w:val="Compact"/>
+      </w:pPr>
+      <w:r>
+        <w:rPr>
+          <w:iCs/>
+          <w:i/>
+        </w:rPr>
+        <w:t xml:space="preserve">Figure 4. Impact report — baseline-vs-incident table with directional deltas.</w:t>
+      </w:r>
+    </w:p>
+    <w:p>
+      <w:pPr>
+        <w:numPr>
+          <w:ilvl w:val="0"/>
+          <w:numId w:val="1004"/>
+        </w:numPr>
+        <w:pStyle w:val="Compact"/>
+      </w:pPr>
+      <w:r>
+        <w:rPr>
+          <w:iCs/>
+          <w:i/>
+        </w:rPr>
+        <w:t xml:space="preserve">Figure 5. Congestion-alert overlay — slow segments flagged red on the network.</w:t>
+      </w:r>
+    </w:p>
+    <w:p>
+      <w:pPr>
+        <w:pStyle w:val="FirstParagraph"/>
+      </w:pPr>
+      <w:r>
+        <w:rPr>
+          <w:bCs/>
+          <w:b/>
+        </w:rPr>
+        <w:t xml:space="preserve">How to produce the evidence.</w:t>
+      </w:r>
+      <w:r>
+        <w:t xml:space="preserve"> </w:t>
+      </w:r>
+      <w:r>
+        <w:t xml:space="preserve">With the stack running (</w:t>
+      </w:r>
+      <w:r>
+        <w:rPr>
+          <w:rStyle w:val="VerbatimChar"/>
+        </w:rPr>
+        <w:t xml:space="preserve">docker compose up</w:t>
+      </w:r>
+      <w:r>
+        <w:t xml:space="preserve">, or</w:t>
+      </w:r>
+      <w:r>
+        <w:t xml:space="preserve"> </w:t>
+      </w:r>
+      <w:r>
+        <w:rPr>
+          <w:rStyle w:val="VerbatimChar"/>
+        </w:rPr>
+        <w:t xml:space="preserve">start_demo.sh</w:t>
+      </w:r>
+      <w:r>
+        <w:t xml:space="preserve">), start each preset from the dashboard, then run:</w:t>
+      </w:r>
+    </w:p>
+    <w:p>
+      <w:pPr>
+        <w:pStyle w:val="SourceCode"/>
+      </w:pPr>
+      <w:r>
+        <w:rPr>
+          <w:rStyle w:val="VerbatimChar"/>
+        </w:rPr>
+        <w:t xml:space="preserve">python scripts/capture_results.py --replay http://localhost:8788/metrics \</w:t>
+      </w:r>
+      <w:r>
+        <w:br/>
+      </w:r>
+      <w:r>
+        <w:rPr>
+          <w:rStyle w:val="VerbatimChar"/>
+        </w:rPr>
+        <w:t xml:space="preserve">  --scenarios baseline_am,crash_arterial,roadworks</w:t>
+      </w:r>
+    </w:p>
+    <w:p>
+      <w:pPr>
+        <w:pStyle w:val="FirstParagraph"/>
+      </w:pPr>
+      <w:r>
+        <w:t xml:space="preserve">This prints Table 1 as Markdown (means, peaks, deltas vs baseline), ready to paste.</w:t>
+      </w:r>
+    </w:p>
+    <w:bookmarkEnd w:id="39"/>
+    <w:bookmarkStart w:id="40" w:name="X5044373dba63eb7897379904086602b8b483b82"/>
+    <w:p>
+      <w:pPr>
+        <w:pStyle w:val="Heading2"/>
+      </w:pPr>
+      <w:r>
+        <w:t xml:space="preserve">4.2. Testing / Validation</w:t>
+      </w:r>
+    </w:p>
+    <w:p>
+      <w:pPr>
+        <w:pStyle w:val="FirstParagraph"/>
+      </w:pPr>
+      <w:r>
+        <w:t xml:space="preserve">Testing used a</w:t>
+      </w:r>
+      <w:r>
+        <w:t xml:space="preserve"> </w:t>
+      </w:r>
+      <w:r>
+        <w:rPr>
+          <w:bCs/>
+          <w:b/>
+        </w:rPr>
+        <w:t xml:space="preserve">pure-core / thin-glue</w:t>
+      </w:r>
+      <w:r>
+        <w:t xml:space="preserve"> </w:t>
+      </w:r>
+      <w:r>
+        <w:t xml:space="preserve">strategy so logic is verified without external</w:t>
+      </w:r>
+      <w:r>
+        <w:t xml:space="preserve"> </w:t>
+      </w:r>
+      <w:r>
+        <w:t xml:space="preserve">systems:</w:t>
       </w:r>
     </w:p>
     <w:p>
@@ -5629,24 +5771,67 @@
       </w:pPr>
       <w:r>
         <w:rPr>
-          <w:iCs/>
-          <w:i/>
-        </w:rPr>
-        <w:t xml:space="preserve">Figure 3. Compare view — baseline vs incident overlaid for a metric, with the</w:t>
-      </w:r>
-      <w:r>
-        <w:rPr>
-          <w:iCs/>
-          <w:i/>
-        </w:rPr>
-        <w:t xml:space="preserve"> </w:t>
-      </w:r>
-      <w:r>
-        <w:rPr>
-          <w:iCs/>
-          <w:i/>
-        </w:rPr>
-        <w:t xml:space="preserve">quantified summary line.</w:t>
+          <w:bCs/>
+          <w:b/>
+        </w:rPr>
+        <w:t xml:space="preserve">91 unit tests</w:t>
+      </w:r>
+      <w:r>
+        <w:t xml:space="preserve">, all passing, run in CI on Python 3.11 and 3.12:</w:t>
+      </w:r>
+    </w:p>
+    <w:p>
+      <w:pPr>
+        <w:numPr>
+          <w:ilvl w:val="1"/>
+          <w:numId w:val="1006"/>
+        </w:numPr>
+        <w:pStyle w:val="Compact"/>
+      </w:pPr>
+      <w:r>
+        <w:t xml:space="preserve">46 core (</w:t>
+      </w:r>
+      <w:r>
+        <w:rPr>
+          <w:rStyle w:val="VerbatimChar"/>
+        </w:rPr>
+        <w:t xml:space="preserve">scripts/tests/</w:t>
+      </w:r>
+      <w:r>
+        <w:t xml:space="preserve">): incidents (14), control_server (11), emitter (6),</w:t>
+      </w:r>
+      <w:r>
+        <w:t xml:space="preserve"> </w:t>
+      </w:r>
+      <w:r>
+        <w:t xml:space="preserve">metrics (6), capture_results (5), replay_server (4).</w:t>
+      </w:r>
+    </w:p>
+    <w:p>
+      <w:pPr>
+        <w:numPr>
+          <w:ilvl w:val="1"/>
+          <w:numId w:val="1006"/>
+        </w:numPr>
+        <w:pStyle w:val="Compact"/>
+      </w:pPr>
+      <w:r>
+        <w:t xml:space="preserve">45 ETL (</w:t>
+      </w:r>
+      <w:r>
+        <w:rPr>
+          <w:rStyle w:val="VerbatimChar"/>
+        </w:rPr>
+        <w:t xml:space="preserve">scripts/etl/tests/</w:t>
+      </w:r>
+      <w:r>
+        <w:t xml:space="preserve">): scenario bridge (9), counts ETL (7), ingest (7),</w:t>
+      </w:r>
+      <w:r>
+        <w:t xml:space="preserve"> </w:t>
+      </w:r>
+      <w:r>
+        <w:t xml:space="preserve">query (6), drive client (6), lambda query (4), lambda ingest (3), s3 store (3).</w:t>
       </w:r>
     </w:p>
     <w:p>
@@ -5659,10 +5844,61 @@
       </w:pPr>
       <w:r>
         <w:rPr>
-          <w:iCs/>
-          <w:i/>
-        </w:rPr>
-        <w:t xml:space="preserve">Figure 4. Impact report — baseline-vs-incident table with directional deltas.</w:t>
+          <w:bCs/>
+          <w:b/>
+        </w:rPr>
+        <w:t xml:space="preserve">Fakes and mocks:</w:t>
+      </w:r>
+      <w:r>
+        <w:t xml:space="preserve"> </w:t>
+      </w:r>
+      <w:r>
+        <w:t xml:space="preserve">a fake</w:t>
+      </w:r>
+      <w:r>
+        <w:t xml:space="preserve"> </w:t>
+      </w:r>
+      <w:r>
+        <w:rPr>
+          <w:rStyle w:val="VerbatimChar"/>
+        </w:rPr>
+        <w:t xml:space="preserve">traci</w:t>
+      </w:r>
+      <w:r>
+        <w:t xml:space="preserve">/</w:t>
+      </w:r>
+      <w:r>
+        <w:rPr>
+          <w:rStyle w:val="VerbatimChar"/>
+        </w:rPr>
+        <w:t xml:space="preserve">Popen</w:t>
+      </w:r>
+      <w:r>
+        <w:t xml:space="preserve"> </w:t>
+      </w:r>
+      <w:r>
+        <w:t xml:space="preserve">and</w:t>
+      </w:r>
+      <w:r>
+        <w:t xml:space="preserve"> </w:t>
+      </w:r>
+      <w:r>
+        <w:rPr>
+          <w:rStyle w:val="VerbatimChar"/>
+        </w:rPr>
+        <w:t xml:space="preserve">moto</w:t>
+      </w:r>
+      <w:r>
+        <w:t xml:space="preserve"> </w:t>
+      </w:r>
+      <w:r>
+        <w:t xml:space="preserve">(mock AWS) mean no SUMO, cloud,</w:t>
+      </w:r>
+      <w:r>
+        <w:t xml:space="preserve"> </w:t>
+      </w:r>
+      <w:r>
+        <w:t xml:space="preserve">or network is needed to test.</w:t>
       </w:r>
     </w:p>
     <w:p>
@@ -5675,124 +5911,35 @@
       </w:pPr>
       <w:r>
         <w:rPr>
-          <w:iCs/>
-          <w:i/>
-        </w:rPr>
-        <w:t xml:space="preserve">Figure 5. Congestion-alert overlay — slow segments flagged red on the network.</w:t>
-      </w:r>
-    </w:p>
-    <w:p>
-      <w:pPr>
-        <w:pStyle w:val="FirstParagraph"/>
-      </w:pPr>
-      <w:r>
-        <w:rPr>
-          <w:bCs/>
-          <w:b/>
-        </w:rPr>
-        <w:t xml:space="preserve">How to produce the evidence.</w:t>
-      </w:r>
-      <w:r>
-        <w:t xml:space="preserve"> </w:t>
-      </w:r>
-      <w:r>
-        <w:t xml:space="preserve">With the stack running (</w:t>
+          <w:bCs/>
+          <w:b/>
+        </w:rPr>
+        <w:t xml:space="preserve">Front-end:</w:t>
+      </w:r>
+      <w:r>
+        <w:t xml:space="preserve"> </w:t>
+      </w:r>
+      <w:r>
+        <w:t xml:space="preserve">the dashboard JavaScript is syntax-checked with</w:t>
+      </w:r>
+      <w:r>
+        <w:t xml:space="preserve"> </w:t>
       </w:r>
       <w:r>
         <w:rPr>
           <w:rStyle w:val="VerbatimChar"/>
         </w:rPr>
-        <w:t xml:space="preserve">docker compose up</w:t>
-      </w:r>
-      <w:r>
-        <w:t xml:space="preserve">, or</w:t>
-      </w:r>
-      <w:r>
-        <w:t xml:space="preserve"> </w:t>
-      </w:r>
-      <w:r>
-        <w:rPr>
-          <w:rStyle w:val="VerbatimChar"/>
-        </w:rPr>
-        <w:t xml:space="preserve">start_demo.sh</w:t>
-      </w:r>
-      <w:r>
-        <w:t xml:space="preserve">), start each preset from the dashboard, then run:</w:t>
-      </w:r>
-    </w:p>
-    <w:p>
-      <w:pPr>
-        <w:pStyle w:val="SourceCode"/>
-      </w:pPr>
-      <w:r>
-        <w:rPr>
-          <w:rStyle w:val="VerbatimChar"/>
-        </w:rPr>
-        <w:t xml:space="preserve">python scripts/capture_results.py --replay http://localhost:8788/metrics \</w:t>
-      </w:r>
-      <w:r>
-        <w:br/>
-      </w:r>
-      <w:r>
-        <w:rPr>
-          <w:rStyle w:val="VerbatimChar"/>
-        </w:rPr>
-        <w:t xml:space="preserve">  --scenarios baseline_am,crash_arterial,roadworks</w:t>
-      </w:r>
-    </w:p>
-    <w:p>
-      <w:pPr>
-        <w:pStyle w:val="FirstParagraph"/>
-      </w:pPr>
-      <w:r>
-        <w:t xml:space="preserve">This prints Table 1 as Markdown (means, peaks, deltas vs baseline), ready to paste.</w:t>
-      </w:r>
-    </w:p>
-    <w:bookmarkEnd w:id="39"/>
-    <w:bookmarkStart w:id="40" w:name="X5044373dba63eb7897379904086602b8b483b82"/>
-    <w:p>
-      <w:pPr>
-        <w:pStyle w:val="Heading2"/>
-      </w:pPr>
-      <w:r>
-        <w:t xml:space="preserve">4.2. Testing / Validation</w:t>
-      </w:r>
-    </w:p>
-    <w:p>
-      <w:pPr>
-        <w:pStyle w:val="FirstParagraph"/>
-      </w:pPr>
-      <w:r>
-        <w:t xml:space="preserve">Testing used a</w:t>
-      </w:r>
-      <w:r>
-        <w:t xml:space="preserve"> </w:t>
-      </w:r>
-      <w:r>
-        <w:rPr>
-          <w:bCs/>
-          <w:b/>
-        </w:rPr>
-        <w:t xml:space="preserve">pure-core / thin-glue</w:t>
-      </w:r>
-      <w:r>
-        <w:t xml:space="preserve"> </w:t>
-      </w:r>
-      <w:r>
-        <w:t xml:space="preserve">strategy so logic is verified without external</w:t>
-      </w:r>
-      <w:r>
-        <w:t xml:space="preserve"> </w:t>
-      </w:r>
-      <w:r>
-        <w:t xml:space="preserve">systems:</w:t>
+        <w:t xml:space="preserve">node --check</w:t>
+      </w:r>
+      <w:r>
+        <w:t xml:space="preserve">.</w:t>
       </w:r>
     </w:p>
     <w:p>
       <w:pPr>
         <w:numPr>
           <w:ilvl w:val="0"/>
-          <w:numId w:val="1006"/>
+          <w:numId w:val="1005"/>
         </w:numPr>
         <w:pStyle w:val="Compact"/>
       </w:pPr>
@@ -5801,71 +5948,124 @@
           <w:bCs/>
           <w:b/>
         </w:rPr>
-        <w:t xml:space="preserve">91 unit tests</w:t>
-      </w:r>
-      <w:r>
-        <w:t xml:space="preserve">, all passing, run in CI on Python 3.11 and 3.12:</w:t>
+        <w:t xml:space="preserve">Continuous integration:</w:t>
+      </w:r>
+      <w:r>
+        <w:t xml:space="preserve"> </w:t>
+      </w:r>
+      <w:r>
+        <w:rPr>
+          <w:rStyle w:val="VerbatimChar"/>
+        </w:rPr>
+        <w:t xml:space="preserve">.github/workflows/ci.yml</w:t>
+      </w:r>
+      <w:r>
+        <w:t xml:space="preserve"> </w:t>
+      </w:r>
+      <w:r>
+        <w:t xml:space="preserve">runs the full suite on every push</w:t>
+      </w:r>
+      <w:r>
+        <w:t xml:space="preserve"> </w:t>
+      </w:r>
+      <w:r>
+        <w:t xml:space="preserve">and pull request; a second workflow publishes the dashboard to GitHub Pages.</w:t>
       </w:r>
     </w:p>
     <w:p>
       <w:pPr>
         <w:numPr>
-          <w:ilvl w:val="1"/>
-          <w:numId w:val="1007"/>
+          <w:ilvl w:val="0"/>
+          <w:numId w:val="1005"/>
         </w:numPr>
         <w:pStyle w:val="Compact"/>
       </w:pPr>
       <w:r>
-        <w:t xml:space="preserve">46 core (</w:t>
-      </w:r>
-      <w:r>
-        <w:rPr>
-          <w:rStyle w:val="VerbatimChar"/>
-        </w:rPr>
-        <w:t xml:space="preserve">scripts/tests/</w:t>
-      </w:r>
-      <w:r>
-        <w:t xml:space="preserve">): incidents (14), control_server (11), emitter (6),</w:t>
-      </w:r>
-      <w:r>
-        <w:t xml:space="preserve"> </w:t>
-      </w:r>
-      <w:r>
-        <w:t xml:space="preserve">metrics (6), capture_results (5), replay_server (4).</w:t>
+        <w:rPr>
+          <w:bCs/>
+          <w:b/>
+        </w:rPr>
+        <w:t xml:space="preserve">Integration / end-to-end:</w:t>
+      </w:r>
+      <w:r>
+        <w:t xml:space="preserve"> </w:t>
+      </w:r>
+      <w:r>
+        <w:t xml:space="preserve">the live path (SUMO -&gt; emitter -&gt; writer -&gt; InfluxDB -&gt;</w:t>
+      </w:r>
+      <w:r>
+        <w:t xml:space="preserve"> </w:t>
+      </w:r>
+      <w:r>
+        <w:t xml:space="preserve">dashboard) and the cloud path (-&gt; API Gateway -&gt; Lambdas -&gt; InfluxDB Cloud) were each</w:t>
+      </w:r>
+      <w:r>
+        <w:t xml:space="preserve"> </w:t>
+      </w:r>
+      <w:r>
+        <w:t xml:space="preserve">exercised and confirmed — a short simulation run was carried through the full pipeline</w:t>
+      </w:r>
+      <w:r>
+        <w:t xml:space="preserve"> </w:t>
+      </w:r>
+      <w:r>
+        <w:t xml:space="preserve">into storage and shown on the dashboard, verifying the whole pipeline rather than each</w:t>
+      </w:r>
+      <w:r>
+        <w:t xml:space="preserve"> </w:t>
+      </w:r>
+      <w:r>
+        <w:t xml:space="preserve">component in isolation.</w:t>
       </w:r>
     </w:p>
     <w:p>
       <w:pPr>
         <w:numPr>
-          <w:ilvl w:val="1"/>
-          <w:numId w:val="1007"/>
+          <w:ilvl w:val="0"/>
+          <w:numId w:val="1005"/>
         </w:numPr>
         <w:pStyle w:val="Compact"/>
       </w:pPr>
       <w:r>
-        <w:t xml:space="preserve">45 ETL (</w:t>
+        <w:rPr>
+          <w:bCs/>
+          <w:b/>
+        </w:rPr>
+        <w:t xml:space="preserve">Infrastructure reproducibility:</w:t>
+      </w:r>
+      <w:r>
+        <w:t xml:space="preserve"> </w:t>
       </w:r>
       <w:r>
         <w:rPr>
           <w:rStyle w:val="VerbatimChar"/>
         </w:rPr>
-        <w:t xml:space="preserve">scripts/etl/tests/</w:t>
-      </w:r>
-      <w:r>
-        <w:t xml:space="preserve">): scenario bridge (9), counts ETL (7), ingest (7),</w:t>
-      </w:r>
-      <w:r>
-        <w:t xml:space="preserve"> </w:t>
-      </w:r>
-      <w:r>
-        <w:t xml:space="preserve">query (6), drive client (6), lambda query (4), lambda ingest (3), s3 store (3).</w:t>
+        <w:t xml:space="preserve">terraform apply</w:t>
+      </w:r>
+      <w:r>
+        <w:t xml:space="preserve"> </w:t>
+      </w:r>
+      <w:r>
+        <w:t xml:space="preserve">was run to provision the AWS stack</w:t>
+      </w:r>
+      <w:r>
+        <w:t xml:space="preserve"> </w:t>
+      </w:r>
+      <w:r>
+        <w:t xml:space="preserve">from configuration, confirming the entire cloud environment can be stood up from code</w:t>
+      </w:r>
+      <w:r>
+        <w:t xml:space="preserve"> </w:t>
+      </w:r>
+      <w:r>
+        <w:t xml:space="preserve">alone.</w:t>
       </w:r>
     </w:p>
     <w:p>
       <w:pPr>
         <w:numPr>
           <w:ilvl w:val="0"/>
-          <w:numId w:val="1006"/>
+          <w:numId w:val="1005"/>
         </w:numPr>
         <w:pStyle w:val="Compact"/>
       </w:pPr>
@@ -5874,259 +6074,32 @@
           <w:bCs/>
           <w:b/>
         </w:rPr>
-        <w:t xml:space="preserve">Fakes and mocks:</w:t>
-      </w:r>
-      <w:r>
-        <w:t xml:space="preserve"> </w:t>
-      </w:r>
-      <w:r>
-        <w:t xml:space="preserve">a fake</w:t>
-      </w:r>
-      <w:r>
-        <w:t xml:space="preserve"> </w:t>
-      </w:r>
-      <w:r>
-        <w:rPr>
-          <w:rStyle w:val="VerbatimChar"/>
-        </w:rPr>
-        <w:t xml:space="preserve">traci</w:t>
-      </w:r>
-      <w:r>
-        <w:t xml:space="preserve">/</w:t>
-      </w:r>
-      <w:r>
-        <w:rPr>
-          <w:rStyle w:val="VerbatimChar"/>
-        </w:rPr>
-        <w:t xml:space="preserve">Popen</w:t>
-      </w:r>
-      <w:r>
-        <w:t xml:space="preserve"> </w:t>
-      </w:r>
-      <w:r>
-        <w:t xml:space="preserve">and</w:t>
-      </w:r>
-      <w:r>
-        <w:t xml:space="preserve"> </w:t>
-      </w:r>
-      <w:r>
-        <w:rPr>
-          <w:rStyle w:val="VerbatimChar"/>
-        </w:rPr>
-        <w:t xml:space="preserve">moto</w:t>
-      </w:r>
-      <w:r>
-        <w:t xml:space="preserve"> </w:t>
-      </w:r>
-      <w:r>
-        <w:t xml:space="preserve">(mock AWS) mean no SUMO, cloud,</w:t>
-      </w:r>
-      <w:r>
-        <w:t xml:space="preserve"> </w:t>
-      </w:r>
-      <w:r>
-        <w:t xml:space="preserve">or network is needed to test.</w:t>
+        <w:t xml:space="preserve">Informal user-acceptance walkthroughs:</w:t>
+      </w:r>
+      <w:r>
+        <w:t xml:space="preserve"> </w:t>
+      </w:r>
+      <w:r>
+        <w:t xml:space="preserve">each decision-support feature was</w:t>
+      </w:r>
+      <w:r>
+        <w:t xml:space="preserve"> </w:t>
+      </w:r>
+      <w:r>
+        <w:t xml:space="preserve">demonstrated live to the supervisor at the relevant milestone review, confirming it</w:t>
+      </w:r>
+      <w:r>
+        <w:t xml:space="preserve"> </w:t>
+      </w:r>
+      <w:r>
+        <w:t xml:space="preserve">behaves as intended against real simulation output.</w:t>
       </w:r>
     </w:p>
     <w:p>
       <w:pPr>
         <w:numPr>
           <w:ilvl w:val="0"/>
-          <w:numId w:val="1006"/>
-        </w:numPr>
-        <w:pStyle w:val="Compact"/>
-      </w:pPr>
-      <w:r>
-        <w:rPr>
-          <w:bCs/>
-          <w:b/>
-        </w:rPr>
-        <w:t xml:space="preserve">Front-end:</w:t>
-      </w:r>
-      <w:r>
-        <w:t xml:space="preserve"> </w:t>
-      </w:r>
-      <w:r>
-        <w:t xml:space="preserve">the dashboard JavaScript is syntax-checked with</w:t>
-      </w:r>
-      <w:r>
-        <w:t xml:space="preserve"> </w:t>
-      </w:r>
-      <w:r>
-        <w:rPr>
-          <w:rStyle w:val="VerbatimChar"/>
-        </w:rPr>
-        <w:t xml:space="preserve">node --check</w:t>
-      </w:r>
-      <w:r>
-        <w:t xml:space="preserve">.</w:t>
-      </w:r>
-    </w:p>
-    <w:p>
-      <w:pPr>
-        <w:numPr>
-          <w:ilvl w:val="0"/>
-          <w:numId w:val="1006"/>
-        </w:numPr>
-        <w:pStyle w:val="Compact"/>
-      </w:pPr>
-      <w:r>
-        <w:rPr>
-          <w:bCs/>
-          <w:b/>
-        </w:rPr>
-        <w:t xml:space="preserve">Continuous integration:</w:t>
-      </w:r>
-      <w:r>
-        <w:t xml:space="preserve"> </w:t>
-      </w:r>
-      <w:r>
-        <w:rPr>
-          <w:rStyle w:val="VerbatimChar"/>
-        </w:rPr>
-        <w:t xml:space="preserve">.github/workflows/ci.yml</w:t>
-      </w:r>
-      <w:r>
-        <w:t xml:space="preserve"> </w:t>
-      </w:r>
-      <w:r>
-        <w:t xml:space="preserve">runs the full suite on every push</w:t>
-      </w:r>
-      <w:r>
-        <w:t xml:space="preserve"> </w:t>
-      </w:r>
-      <w:r>
-        <w:t xml:space="preserve">and pull request; a second workflow publishes the dashboard to GitHub Pages.</w:t>
-      </w:r>
-    </w:p>
-    <w:p>
-      <w:pPr>
-        <w:numPr>
-          <w:ilvl w:val="0"/>
-          <w:numId w:val="1006"/>
-        </w:numPr>
-        <w:pStyle w:val="Compact"/>
-      </w:pPr>
-      <w:r>
-        <w:rPr>
-          <w:bCs/>
-          <w:b/>
-        </w:rPr>
-        <w:t xml:space="preserve">Integration / end-to-end:</w:t>
-      </w:r>
-      <w:r>
-        <w:t xml:space="preserve"> </w:t>
-      </w:r>
-      <w:r>
-        <w:t xml:space="preserve">the live path (SUMO -&gt; emitter -&gt; writer -&gt; InfluxDB -&gt;</w:t>
-      </w:r>
-      <w:r>
-        <w:t xml:space="preserve"> </w:t>
-      </w:r>
-      <w:r>
-        <w:t xml:space="preserve">dashboard) and the cloud path (-&gt; API Gateway -&gt; Lambdas -&gt; InfluxDB Cloud) were each</w:t>
-      </w:r>
-      <w:r>
-        <w:t xml:space="preserve"> </w:t>
-      </w:r>
-      <w:r>
-        <w:t xml:space="preserve">exercised and confirmed — a short simulation run was carried through the full pipeline</w:t>
-      </w:r>
-      <w:r>
-        <w:t xml:space="preserve"> </w:t>
-      </w:r>
-      <w:r>
-        <w:t xml:space="preserve">into storage and shown on the dashboard, verifying the whole pipeline rather than each</w:t>
-      </w:r>
-      <w:r>
-        <w:t xml:space="preserve"> </w:t>
-      </w:r>
-      <w:r>
-        <w:t xml:space="preserve">component in isolation.</w:t>
-      </w:r>
-    </w:p>
-    <w:p>
-      <w:pPr>
-        <w:numPr>
-          <w:ilvl w:val="0"/>
-          <w:numId w:val="1006"/>
-        </w:numPr>
-        <w:pStyle w:val="Compact"/>
-      </w:pPr>
-      <w:r>
-        <w:rPr>
-          <w:bCs/>
-          <w:b/>
-        </w:rPr>
-        <w:t xml:space="preserve">Infrastructure reproducibility:</w:t>
-      </w:r>
-      <w:r>
-        <w:t xml:space="preserve"> </w:t>
-      </w:r>
-      <w:r>
-        <w:rPr>
-          <w:rStyle w:val="VerbatimChar"/>
-        </w:rPr>
-        <w:t xml:space="preserve">terraform apply</w:t>
-      </w:r>
-      <w:r>
-        <w:t xml:space="preserve"> </w:t>
-      </w:r>
-      <w:r>
-        <w:t xml:space="preserve">was run to provision the AWS stack</w:t>
-      </w:r>
-      <w:r>
-        <w:t xml:space="preserve"> </w:t>
-      </w:r>
-      <w:r>
-        <w:t xml:space="preserve">from configuration, confirming the entire cloud environment can be stood up from code</w:t>
-      </w:r>
-      <w:r>
-        <w:t xml:space="preserve"> </w:t>
-      </w:r>
-      <w:r>
-        <w:t xml:space="preserve">alone.</w:t>
-      </w:r>
-    </w:p>
-    <w:p>
-      <w:pPr>
-        <w:numPr>
-          <w:ilvl w:val="0"/>
-          <w:numId w:val="1006"/>
-        </w:numPr>
-        <w:pStyle w:val="Compact"/>
-      </w:pPr>
-      <w:r>
-        <w:rPr>
-          <w:bCs/>
-          <w:b/>
-        </w:rPr>
-        <w:t xml:space="preserve">Informal user-acceptance walkthroughs:</w:t>
-      </w:r>
-      <w:r>
-        <w:t xml:space="preserve"> </w:t>
-      </w:r>
-      <w:r>
-        <w:t xml:space="preserve">each decision-support feature was</w:t>
-      </w:r>
-      <w:r>
-        <w:t xml:space="preserve"> </w:t>
-      </w:r>
-      <w:r>
-        <w:t xml:space="preserve">demonstrated live to the supervisor at the relevant milestone review, confirming it</w:t>
-      </w:r>
-      <w:r>
-        <w:t xml:space="preserve"> </w:t>
-      </w:r>
-      <w:r>
-        <w:t xml:space="preserve">behaves as intended against real simulation output.</w:t>
-      </w:r>
-    </w:p>
-    <w:p>
-      <w:pPr>
-        <w:numPr>
-          <w:ilvl w:val="0"/>
-          <w:numId w:val="1006"/>
+          <w:numId w:val="1005"/>
         </w:numPr>
         <w:pStyle w:val="Compact"/>
       </w:pPr>
@@ -7645,9 +7618,6 @@
     <w:abstractNumId w:val="991"/>
   </w:num>
   <w:num w:numId="1003">
-    <w:abstractNumId w:val="991"/>
-  </w:num>
-  <w:num w:numId="1004">
     <w:abstractNumId w:val="99411"/>
     <w:lvlOverride w:ilvl="0">
       <w:startOverride w:val="1"/>
@@ -7677,13 +7647,13 @@
       <w:startOverride w:val="1"/>
     </w:lvlOverride>
   </w:num>
+  <w:num w:numId="1004">
+    <w:abstractNumId w:val="991"/>
+  </w:num>
   <w:num w:numId="1005">
     <w:abstractNumId w:val="991"/>
   </w:num>
   <w:num w:numId="1006">
-    <w:abstractNumId w:val="991"/>
-  </w:num>
-  <w:num w:numId="1007">
     <w:abstractNumId w:val="991"/>
   </w:num>
 </w:numbering>

</xml_diff>

<commit_message>
docs(report): add Figure 7 decision-support control-flow diagram
Rendered a Mermaid flowchart of the authenticated cloud control path
(browser -> control API Gateway -> authorizer -> traffic-control Lambda
-> SSM -> EC2 sim host -> live path -> InfluxDB -> Compare/Impact) and
wired it into §3.2 as Figure 7. Re-exported FINAL_REPORT.docx.

Co-Authored-By: Claude Opus 4.8 <noreply@anthropic.com>
Claude-Session: https://claude.ai/code/session_01JPrcUrs3JqCy2UmTJDjuip
</commit_message>
<xml_diff>
--- a/docs/FINAL_REPORT.docx
+++ b/docs/FINAL_REPORT.docx
@@ -2298,7 +2298,7 @@
     </w:p>
     <w:bookmarkEnd w:id="31"/>
     <w:bookmarkEnd w:id="32"/>
-    <w:bookmarkStart w:id="40" w:name="methods"/>
+    <w:bookmarkStart w:id="43" w:name="methods"/>
     <w:p>
       <w:pPr>
         <w:pStyle w:val="Heading1"/>
@@ -2942,7 +2942,7 @@
       </w:r>
     </w:p>
     <w:bookmarkEnd w:id="33"/>
-    <w:bookmarkStart w:id="37" w:name="design"/>
+    <w:bookmarkStart w:id="40" w:name="design"/>
     <w:p>
       <w:pPr>
         <w:pStyle w:val="Heading2"/>
@@ -3535,8 +3535,224 @@
         <w:t xml:space="preserve">can be compared against the baseline in the dashboard’s Compare and Impact views.</w:t>
       </w:r>
     </w:p>
-    <w:bookmarkEnd w:id="37"/>
-    <w:bookmarkStart w:id="38" w:name="risks-and-challenges"/>
+    <w:p>
+      <w:pPr>
+        <w:pStyle w:val="CaptionedFigure"/>
+      </w:pPr>
+      <w:r>
+        <w:drawing>
+          <wp:inline>
+            <wp:extent cx="5334000" cy="462642"/>
+            <wp:effectExtent b="0" l="0" r="0" t="0"/>
+            <wp:docPr descr="Decision-support control and comparison flow" title="" id="38" name="Picture"/>
+            <a:graphic>
+              <a:graphicData uri="http://schemas.openxmlformats.org/drawingml/2006/picture">
+                <pic:pic>
+                  <pic:nvPicPr>
+                    <pic:cNvPr descr="img/decision_support_flow.png" id="39" name="Picture"/>
+                    <pic:cNvPicPr>
+                      <a:picLocks noChangeArrowheads="1" noChangeAspect="1"/>
+                    </pic:cNvPicPr>
+                  </pic:nvPicPr>
+                  <pic:blipFill>
+                    <a:blip r:embed="rId37"/>
+                    <a:stretch>
+                      <a:fillRect/>
+                    </a:stretch>
+                  </pic:blipFill>
+                  <pic:spPr bwMode="auto">
+                    <a:xfrm>
+                      <a:off x="0" y="0"/>
+                      <a:ext cx="5334000" cy="462642"/>
+                    </a:xfrm>
+                    <a:prstGeom prst="rect">
+                      <a:avLst/>
+                    </a:prstGeom>
+                    <a:noFill/>
+                    <a:ln w="9525">
+                      <a:noFill/>
+                      <a:headEnd/>
+                      <a:tailEnd/>
+                    </a:ln>
+                  </pic:spPr>
+                </pic:pic>
+              </a:graphicData>
+            </a:graphic>
+          </wp:inline>
+        </w:drawing>
+      </w:r>
+    </w:p>
+    <w:p>
+      <w:pPr>
+        <w:pStyle w:val="ImageCaption"/>
+      </w:pPr>
+      <w:r>
+        <w:t xml:space="preserve">Decision-support control and comparison flow</w:t>
+      </w:r>
+    </w:p>
+    <w:p>
+      <w:pPr>
+        <w:pStyle w:val="BodyText"/>
+      </w:pPr>
+      <w:r>
+        <w:rPr>
+          <w:iCs/>
+          <w:i/>
+        </w:rPr>
+        <w:t xml:space="preserve">Figure 7. Decision-support control path. A browser action (named preset or click-a-road</w:t>
+      </w:r>
+      <w:r>
+        <w:rPr>
+          <w:iCs/>
+          <w:i/>
+        </w:rPr>
+        <w:t xml:space="preserve"> </w:t>
+      </w:r>
+      <w:r>
+        <w:rPr>
+          <w:iCs/>
+          <w:i/>
+        </w:rPr>
+        <w:t xml:space="preserve">closure) drives the authenticated cloud control API (API Gateway -&gt; token authorizer -&gt;</w:t>
+      </w:r>
+      <w:r>
+        <w:rPr>
+          <w:iCs/>
+          <w:i/>
+        </w:rPr>
+        <w:t xml:space="preserve"> </w:t>
+      </w:r>
+      <w:r>
+        <w:rPr>
+          <w:rStyle w:val="VerbatimChar"/>
+          <w:iCs/>
+          <w:i/>
+        </w:rPr>
+        <w:t xml:space="preserve">traffic-control</w:t>
+      </w:r>
+      <w:r>
+        <w:rPr>
+          <w:iCs/>
+          <w:i/>
+        </w:rPr>
+        <w:t xml:space="preserve"> </w:t>
+      </w:r>
+      <w:r>
+        <w:rPr>
+          <w:iCs/>
+          <w:i/>
+        </w:rPr>
+        <w:t xml:space="preserve">Lambda, with a preset allowlist and a regex-validated edge id), which</w:t>
+      </w:r>
+      <w:r>
+        <w:rPr>
+          <w:iCs/>
+          <w:i/>
+        </w:rPr>
+        <w:t xml:space="preserve"> </w:t>
+      </w:r>
+      <w:r>
+        <w:rPr>
+          <w:iCs/>
+          <w:i/>
+        </w:rPr>
+        <w:t xml:space="preserve">switches the tagged scenario on the EC2 sim host via AWS Systems Manager. The run reuses the</w:t>
+      </w:r>
+      <w:r>
+        <w:rPr>
+          <w:iCs/>
+          <w:i/>
+        </w:rPr>
+        <w:t xml:space="preserve"> </w:t>
+      </w:r>
+      <w:r>
+        <w:rPr>
+          <w:iCs/>
+          <w:i/>
+        </w:rPr>
+        <w:t xml:space="preserve">same live path as Figure 2, and its</w:t>
+      </w:r>
+      <w:r>
+        <w:rPr>
+          <w:iCs/>
+          <w:i/>
+        </w:rPr>
+        <w:t xml:space="preserve"> </w:t>
+      </w:r>
+      <w:r>
+        <w:rPr>
+          <w:rStyle w:val="VerbatimChar"/>
+          <w:iCs/>
+          <w:i/>
+        </w:rPr>
+        <w:t xml:space="preserve">scenario_id</w:t>
+      </w:r>
+      <w:r>
+        <w:rPr>
+          <w:iCs/>
+          <w:i/>
+        </w:rPr>
+        <w:t xml:space="preserve">-tagged metrics feed the dashboard’s Compare</w:t>
+      </w:r>
+      <w:r>
+        <w:rPr>
+          <w:iCs/>
+          <w:i/>
+        </w:rPr>
+        <w:t xml:space="preserve"> </w:t>
+      </w:r>
+      <w:r>
+        <w:rPr>
+          <w:iCs/>
+          <w:i/>
+        </w:rPr>
+        <w:t xml:space="preserve">and Impact views — closing the loop from</w:t>
+      </w:r>
+      <w:r>
+        <w:rPr>
+          <w:iCs/>
+          <w:i/>
+        </w:rPr>
+        <w:t xml:space="preserve"> </w:t>
+      </w:r>
+      <w:r>
+        <w:rPr>
+          <w:iCs/>
+          <w:i/>
+        </w:rPr>
+        <w:t xml:space="preserve">“</w:t>
+      </w:r>
+      <w:r>
+        <w:rPr>
+          <w:iCs/>
+          <w:i/>
+        </w:rPr>
+        <w:t xml:space="preserve">what if?</w:t>
+      </w:r>
+      <w:r>
+        <w:rPr>
+          <w:iCs/>
+          <w:i/>
+        </w:rPr>
+        <w:t xml:space="preserve">”</w:t>
+      </w:r>
+      <w:r>
+        <w:rPr>
+          <w:iCs/>
+          <w:i/>
+        </w:rPr>
+        <w:t xml:space="preserve"> </w:t>
+      </w:r>
+      <w:r>
+        <w:rPr>
+          <w:iCs/>
+          <w:i/>
+        </w:rPr>
+        <w:t xml:space="preserve">to measured impact.</w:t>
+      </w:r>
+    </w:p>
+    <w:bookmarkEnd w:id="40"/>
+    <w:bookmarkStart w:id="41" w:name="risks-and-challenges"/>
     <w:p>
       <w:pPr>
         <w:pStyle w:val="Heading2"/>
@@ -4115,8 +4331,8 @@
         </w:tc>
       </w:tr>
     </w:tbl>
-    <w:bookmarkEnd w:id="38"/>
-    <w:bookmarkStart w:id="39" w:name="implementation"/>
+    <w:bookmarkEnd w:id="41"/>
+    <w:bookmarkStart w:id="42" w:name="implementation"/>
     <w:p>
       <w:pPr>
         <w:pStyle w:val="Heading2"/>
@@ -4586,9 +4802,9 @@
         </w:pict>
       </w:r>
     </w:p>
-    <w:bookmarkEnd w:id="39"/>
-    <w:bookmarkEnd w:id="40"/>
-    <w:bookmarkStart w:id="43" w:name="results-and-outcomes"/>
+    <w:bookmarkEnd w:id="42"/>
+    <w:bookmarkEnd w:id="43"/>
+    <w:bookmarkStart w:id="46" w:name="results-and-outcomes"/>
     <w:p>
       <w:pPr>
         <w:pStyle w:val="Heading1"/>
@@ -4597,7 +4813,7 @@
         <w:t xml:space="preserve">4. RESULTS AND OUTCOMES</w:t>
       </w:r>
     </w:p>
-    <w:bookmarkStart w:id="41" w:name="evidence-of-deliverables"/>
+    <w:bookmarkStart w:id="44" w:name="evidence-of-deliverables"/>
     <w:p>
       <w:pPr>
         <w:pStyle w:val="Heading2"/>
@@ -6075,8 +6291,8 @@
         <w:t xml:space="preserve">This prints Table 1 as Markdown (means, peaks, deltas vs baseline), ready to paste.</w:t>
       </w:r>
     </w:p>
-    <w:bookmarkEnd w:id="41"/>
-    <w:bookmarkStart w:id="42" w:name="testing-validation"/>
+    <w:bookmarkEnd w:id="44"/>
+    <w:bookmarkStart w:id="45" w:name="testing-validation"/>
     <w:p>
       <w:pPr>
         <w:pStyle w:val="Heading2"/>
@@ -6537,9 +6753,9 @@
         </w:pict>
       </w:r>
     </w:p>
-    <w:bookmarkEnd w:id="42"/>
-    <w:bookmarkEnd w:id="43"/>
-    <w:bookmarkStart w:id="47" w:name="reflections"/>
+    <w:bookmarkEnd w:id="45"/>
+    <w:bookmarkEnd w:id="46"/>
+    <w:bookmarkStart w:id="50" w:name="reflections"/>
     <w:p>
       <w:pPr>
         <w:pStyle w:val="Heading1"/>
@@ -6548,7 +6764,7 @@
         <w:t xml:space="preserve">5. REFLECTIONS</w:t>
       </w:r>
     </w:p>
-    <w:bookmarkStart w:id="44" w:name="reflections-1"/>
+    <w:bookmarkStart w:id="47" w:name="reflections-1"/>
     <w:p>
       <w:pPr>
         <w:pStyle w:val="Heading2"/>
@@ -6744,8 +6960,8 @@
         <w:t xml:space="preserve">budget, documenting honestly (including limitations), and communicating decisions.</w:t>
       </w:r>
     </w:p>
-    <w:bookmarkEnd w:id="44"/>
-    <w:bookmarkStart w:id="45" w:name="use-of-generative-ai"/>
+    <w:bookmarkEnd w:id="47"/>
+    <w:bookmarkStart w:id="48" w:name="use-of-generative-ai"/>
     <w:p>
       <w:pPr>
         <w:pStyle w:val="Heading2"/>
@@ -6884,8 +7100,8 @@
         <w:t xml:space="preserve">submission.)</w:t>
       </w:r>
     </w:p>
-    <w:bookmarkEnd w:id="45"/>
-    <w:bookmarkStart w:id="46" w:name="conclusions"/>
+    <w:bookmarkEnd w:id="48"/>
+    <w:bookmarkStart w:id="49" w:name="conclusions"/>
     <w:p>
       <w:pPr>
         <w:pStyle w:val="Heading2"/>
@@ -7081,9 +7297,9 @@
         </w:pict>
       </w:r>
     </w:p>
-    <w:bookmarkEnd w:id="46"/>
-    <w:bookmarkEnd w:id="47"/>
-    <w:bookmarkStart w:id="48" w:name="references"/>
+    <w:bookmarkEnd w:id="49"/>
+    <w:bookmarkEnd w:id="50"/>
+    <w:bookmarkStart w:id="51" w:name="references"/>
     <w:p>
       <w:pPr>
         <w:pStyle w:val="Heading1"/>
@@ -7491,8 +7707,8 @@
         </w:pict>
       </w:r>
     </w:p>
-    <w:bookmarkEnd w:id="48"/>
-    <w:bookmarkStart w:id="50" w:name="appendices"/>
+    <w:bookmarkEnd w:id="51"/>
+    <w:bookmarkStart w:id="53" w:name="appendices"/>
     <w:p>
       <w:pPr>
         <w:pStyle w:val="Heading1"/>
@@ -7501,7 +7717,7 @@
         <w:t xml:space="preserve">7. APPENDICES</w:t>
       </w:r>
     </w:p>
-    <w:bookmarkStart w:id="49" w:name="appendix-a-software-project-artefacts"/>
+    <w:bookmarkStart w:id="52" w:name="appendix-a-software-project-artefacts"/>
     <w:p>
       <w:pPr>
         <w:pStyle w:val="Heading2"/>
@@ -7607,8 +7823,8 @@
         <w:t xml:space="preserve">output for Table 1.</w:t>
       </w:r>
     </w:p>
-    <w:bookmarkEnd w:id="49"/>
-    <w:bookmarkEnd w:id="50"/>
+    <w:bookmarkEnd w:id="52"/>
+    <w:bookmarkEnd w:id="53"/>
     <w:sectPr/>
   </w:body>
 </w:document>

</xml_diff>